<commit_message>
docs: add the department-list request to the hospital data-requirements doc
Section 3 asks for the two halves separately, because they are not the same
ask: the complete list with ids as a one-time sheet (blocking — matching our
departments to theirs is a human decision made once), and an API to re-read
it so an added or retired department does not leave us routing to a dead id.
Notes plainly that we route to a department, never a service point or a
doctor, and that we would call the endpoint occasionally, not per patient.

Co-Authored-By: Claude Opus 5 <noreply@anthropic.com>
Claude-Session: https://claude.ai/code/session_013jGr64EsyUjwXguxfZMkqs
</commit_message>
<xml_diff>
--- a/docs/data-requirements-hospital.docx
+++ b/docs/data-requirements-hospital.docx
@@ -7677,6 +7677,702 @@
           <w:cs/>
         </w:rPr>
       </w:pPr>
+    </w:p>
+    <w:p>
+      <w:pPr>
+        <w:pStyle w:val="ListParagraph"/>
+        <w:numPr>
+          <w:ilvl w:val="0"/>
+          <w:numId w:val="3"/>
+        </w:numPr>
+        <w:spacing w:after="0"/>
+        <w:rPr>
+          <w:rFonts w:ascii="TH SarabunPSK" w:hAnsi="TH SarabunPSK" w:cs="TH SarabunPSK"/>
+          <w:b/>
+          <w:bCs/>
+          <w:sz w:val="32"/>
+          <w:szCs w:val="32"/>
+        </w:rPr>
+      </w:pPr>
+      <w:r>
+        <w:rPr>
+          <w:rFonts w:ascii="TH SarabunPSK" w:hAnsi="TH SarabunPSK" w:cs="TH SarabunPSK" w:hint="cs"/>
+          <w:b/>
+          <w:bCs/>
+          <w:sz w:val="32"/>
+          <w:szCs w:val="32"/>
+        </w:rPr>
+        <w:t>Department Master Data (Get Data)</w:t>
+      </w:r>
+    </w:p>
+    <w:p>
+      <w:pPr>
+        <w:spacing w:after="0"/>
+        <w:rPr>
+          <w:rFonts w:ascii="TH SarabunPSK" w:hAnsi="TH SarabunPSK" w:cs="TH SarabunPSK"/>
+          <w:sz w:val="32"/>
+          <w:szCs w:val="32"/>
+        </w:rPr>
+      </w:pPr>
+      <w:r>
+        <w:rPr>
+          <w:rFonts w:ascii="TH SarabunPSK" w:hAnsi="TH SarabunPSK" w:cs="TH SarabunPSK" w:hint="cs"/>
+          <w:sz w:val="32"/>
+          <w:szCs w:val="32"/>
+          <w:cs/>
+        </w:rPr>
+        <w:t>3.1. รายชื่อแผนกทั้งหมดและรหัสแผนก (Department List)</w:t>
+      </w:r>
+      <w:r>
+        <w:rPr>
+          <w:rFonts w:ascii="TH SarabunPSK" w:hAnsi="TH SarabunPSK" w:cs="TH SarabunPSK"/>
+          <w:sz w:val="32"/>
+          <w:szCs w:val="32"/>
+          <w:cs/>
+        </w:rPr>
+      </w:r>
+      <w:r>
+        <w:rPr>
+          <w:rFonts w:ascii="TH SarabunPSK" w:hAnsi="TH SarabunPSK" w:cs="TH SarabunPSK" w:hint="cs"/>
+          <w:sz w:val="32"/>
+          <w:szCs w:val="32"/>
+          <w:cs/>
+        </w:rPr>
+      </w:r>
+      <w:r>
+        <w:rPr>
+          <w:rFonts w:ascii="TH SarabunPSK" w:hAnsi="TH SarabunPSK" w:cs="TH SarabunPSK"/>
+          <w:sz w:val="32"/>
+          <w:szCs w:val="32"/>
+          <w:cs/>
+        </w:rPr>
+      </w:r>
+      <w:r>
+        <w:rPr>
+          <w:rFonts w:ascii="TH SarabunPSK" w:hAnsi="TH SarabunPSK" w:cs="TH SarabunPSK"/>
+          <w:sz w:val="32"/>
+          <w:szCs w:val="32"/>
+        </w:rPr>
+      </w:r>
+    </w:p>
+    <w:tbl>
+      <w:tblPr>
+        <w:tblStyle w:val="GridTable4-Accent1"/>
+        <w:tblW w:w="5000" w:type="pct"/>
+        <w:tblLook w:val="04A0" w:firstRow="1" w:lastRow="0" w:firstColumn="1" w:lastColumn="0" w:noHBand="0" w:noVBand="1"/>
+      </w:tblPr>
+      <w:tblGrid>
+        <w:gridCol w:w="2223"/>
+        <w:gridCol w:w="1949"/>
+        <w:gridCol w:w="2897"/>
+        <w:gridCol w:w="2281"/>
+        <w:gridCol w:w="1800"/>
+      </w:tblGrid>
+      <w:tr>
+        <w:trPr>
+          <w:cnfStyle w:val="100000000000" w:firstRow="1" w:lastRow="0" w:firstColumn="0" w:lastColumn="0" w:oddVBand="0" w:evenVBand="0" w:oddHBand="0" w:evenHBand="0" w:firstRowFirstColumn="0" w:firstRowLastColumn="0" w:lastRowFirstColumn="0" w:lastRowLastColumn="0"/>
+        </w:trPr>
+        <w:tc>
+          <w:tcPr>
+            <w:cnfStyle w:val="001000000000" w:firstRow="0" w:lastRow="0" w:firstColumn="1" w:lastColumn="0" w:oddVBand="0" w:evenVBand="0" w:oddHBand="0" w:evenHBand="0" w:firstRowFirstColumn="0" w:firstRowLastColumn="0" w:lastRowFirstColumn="0" w:lastRowLastColumn="0"/>
+            <w:tcW w:w="1189" w:type="pct"/>
+            <w:shd w:val="clear" w:color="auto" w:fill="355D7E" w:themeFill="accent1" w:themeFillShade="80"/>
+          </w:tcPr>
+          <w:p>
+            <w:pPr>
+              <w:rPr>
+                <w:rFonts w:ascii="TH SarabunPSK" w:eastAsia="Yu Mincho" w:hAnsi="TH SarabunPSK" w:cs="TH SarabunPSK"/>
+                <w:sz w:val="32"/>
+                <w:szCs w:val="32"/>
+                <w:cs/>
+                <w:lang w:eastAsia="ja-JP"/>
+              </w:rPr>
+            </w:pPr>
+            <w:r>
+              <w:rPr>
+                <w:rFonts w:ascii="TH SarabunPSK" w:eastAsia="Yu Mincho" w:hAnsi="TH SarabunPSK" w:cs="TH SarabunPSK" w:hint="cs"/>
+                <w:sz w:val="32"/>
+                <w:szCs w:val="32"/>
+                <w:cs/>
+                <w:lang w:eastAsia="ja-JP"/>
+              </w:rPr>
+              <w:t>พารามิเตอร์ (</w:t>
+            </w:r>
+            <w:r>
+              <w:rPr>
+                <w:rFonts w:ascii="TH SarabunPSK" w:eastAsia="Yu Mincho" w:hAnsi="TH SarabunPSK" w:cs="TH SarabunPSK" w:hint="cs"/>
+                <w:sz w:val="32"/>
+                <w:szCs w:val="32"/>
+                <w:lang w:eastAsia="ja-JP"/>
+              </w:rPr>
+              <w:t>Parameters</w:t>
+            </w:r>
+            <w:r>
+              <w:rPr>
+                <w:rFonts w:ascii="TH SarabunPSK" w:eastAsia="Yu Mincho" w:hAnsi="TH SarabunPSK" w:cs="TH SarabunPSK" w:hint="cs"/>
+                <w:sz w:val="32"/>
+                <w:szCs w:val="32"/>
+                <w:cs/>
+                <w:lang w:eastAsia="ja-JP"/>
+              </w:rPr>
+              <w:t>)</w:t>
+            </w:r>
+          </w:p>
+        </w:tc>
+        <w:tc>
+          <w:tcPr>
+            <w:tcW w:w="1042" w:type="pct"/>
+            <w:shd w:val="clear" w:color="auto" w:fill="355D7E" w:themeFill="accent1" w:themeFillShade="80"/>
+          </w:tcPr>
+          <w:p>
+            <w:pPr>
+              <w:cnfStyle w:val="100000000000" w:firstRow="1" w:lastRow="0" w:firstColumn="0" w:lastColumn="0" w:oddVBand="0" w:evenVBand="0" w:oddHBand="0" w:evenHBand="0" w:firstRowFirstColumn="0" w:firstRowLastColumn="0" w:lastRowFirstColumn="0" w:lastRowLastColumn="0"/>
+              <w:rPr>
+                <w:rFonts w:ascii="TH SarabunPSK" w:hAnsi="TH SarabunPSK" w:cs="TH SarabunPSK"/>
+                <w:sz w:val="32"/>
+                <w:szCs w:val="32"/>
+              </w:rPr>
+            </w:pPr>
+            <w:r>
+              <w:rPr>
+                <w:rFonts w:ascii="TH SarabunPSK" w:hAnsi="TH SarabunPSK" w:cs="TH SarabunPSK" w:hint="cs"/>
+                <w:sz w:val="32"/>
+                <w:szCs w:val="32"/>
+                <w:cs/>
+              </w:rPr>
+              <w:t>ประเภทของข้อมูล (</w:t>
+            </w:r>
+            <w:r>
+              <w:rPr>
+                <w:rFonts w:ascii="TH SarabunPSK" w:hAnsi="TH SarabunPSK" w:cs="TH SarabunPSK" w:hint="cs"/>
+                <w:sz w:val="32"/>
+                <w:szCs w:val="32"/>
+              </w:rPr>
+              <w:t>type</w:t>
+            </w:r>
+            <w:r>
+              <w:rPr>
+                <w:rFonts w:ascii="TH SarabunPSK" w:hAnsi="TH SarabunPSK" w:cs="TH SarabunPSK" w:hint="cs"/>
+                <w:sz w:val="32"/>
+                <w:szCs w:val="32"/>
+                <w:cs/>
+              </w:rPr>
+              <w:t>)</w:t>
+            </w:r>
+          </w:p>
+        </w:tc>
+        <w:tc>
+          <w:tcPr>
+            <w:tcW w:w="1549" w:type="pct"/>
+            <w:shd w:val="clear" w:color="auto" w:fill="355D7E" w:themeFill="accent1" w:themeFillShade="80"/>
+          </w:tcPr>
+          <w:p>
+            <w:pPr>
+              <w:cnfStyle w:val="100000000000" w:firstRow="1" w:lastRow="0" w:firstColumn="0" w:lastColumn="0" w:oddVBand="0" w:evenVBand="0" w:oddHBand="0" w:evenHBand="0" w:firstRowFirstColumn="0" w:firstRowLastColumn="0" w:lastRowFirstColumn="0" w:lastRowLastColumn="0"/>
+              <w:rPr>
+                <w:rFonts w:ascii="TH SarabunPSK" w:hAnsi="TH SarabunPSK" w:cs="TH SarabunPSK"/>
+                <w:sz w:val="32"/>
+                <w:szCs w:val="32"/>
+              </w:rPr>
+            </w:pPr>
+            <w:r>
+              <w:rPr>
+                <w:rFonts w:ascii="TH SarabunPSK" w:hAnsi="TH SarabunPSK" w:cs="TH SarabunPSK" w:hint="cs"/>
+                <w:sz w:val="32"/>
+                <w:szCs w:val="32"/>
+                <w:cs/>
+              </w:rPr>
+              <w:t>คำอธิบาย (</w:t>
+            </w:r>
+            <w:r>
+              <w:rPr>
+                <w:rFonts w:ascii="TH SarabunPSK" w:hAnsi="TH SarabunPSK" w:cs="TH SarabunPSK" w:hint="cs"/>
+                <w:sz w:val="32"/>
+                <w:szCs w:val="32"/>
+              </w:rPr>
+              <w:t>Description</w:t>
+            </w:r>
+            <w:r>
+              <w:rPr>
+                <w:rFonts w:ascii="TH SarabunPSK" w:hAnsi="TH SarabunPSK" w:cs="TH SarabunPSK" w:hint="cs"/>
+                <w:sz w:val="32"/>
+                <w:szCs w:val="32"/>
+                <w:cs/>
+              </w:rPr>
+              <w:t>)</w:t>
+            </w:r>
+          </w:p>
+        </w:tc>
+        <w:tc>
+          <w:tcPr>
+            <w:tcW w:w="1220" w:type="pct"/>
+            <w:shd w:val="clear" w:color="auto" w:fill="355D7E" w:themeFill="accent1" w:themeFillShade="80"/>
+          </w:tcPr>
+          <w:p>
+            <w:pPr>
+              <w:cnfStyle w:val="100000000000" w:firstRow="1" w:lastRow="0" w:firstColumn="0" w:lastColumn="0" w:oddVBand="0" w:evenVBand="0" w:oddHBand="0" w:evenHBand="0" w:firstRowFirstColumn="0" w:firstRowLastColumn="0" w:lastRowFirstColumn="0" w:lastRowLastColumn="0"/>
+              <w:rPr>
+                <w:rFonts w:ascii="TH SarabunPSK" w:hAnsi="TH SarabunPSK" w:cs="TH SarabunPSK" w:hint="cs"/>
+                <w:sz w:val="32"/>
+                <w:szCs w:val="32"/>
+                <w:cs/>
+              </w:rPr>
+            </w:pPr>
+            <w:r>
+              <w:rPr>
+                <w:rFonts w:ascii="TH SarabunPSK" w:hAnsi="TH SarabunPSK" w:cs="TH SarabunPSK"/>
+                <w:sz w:val="32"/>
+                <w:szCs w:val="32"/>
+                <w:cs/>
+              </w:rPr>
+              <w:t>ตัวอย่างข้</w:t>
+            </w:r>
+            <w:r>
+              <w:rPr>
+                <w:rFonts w:ascii="TH SarabunPSK" w:hAnsi="TH SarabunPSK" w:cs="TH SarabunPSK" w:hint="cs"/>
+                <w:sz w:val="32"/>
+                <w:szCs w:val="32"/>
+                <w:cs/>
+              </w:rPr>
+              <w:t>อ</w:t>
+            </w:r>
+            <w:r>
+              <w:rPr>
+                <w:rFonts w:ascii="TH SarabunPSK" w:hAnsi="TH SarabunPSK" w:cs="TH SarabunPSK"/>
+                <w:sz w:val="32"/>
+                <w:szCs w:val="32"/>
+                <w:cs/>
+              </w:rPr>
+              <w:t>ม</w:t>
+            </w:r>
+            <w:r>
+              <w:rPr>
+                <w:rFonts w:ascii="TH SarabunPSK" w:hAnsi="TH SarabunPSK" w:cs="TH SarabunPSK" w:hint="cs"/>
+                <w:sz w:val="32"/>
+                <w:szCs w:val="32"/>
+                <w:cs/>
+              </w:rPr>
+              <w:t>ู</w:t>
+            </w:r>
+            <w:r>
+              <w:rPr>
+                <w:rFonts w:ascii="TH SarabunPSK" w:hAnsi="TH SarabunPSK" w:cs="TH SarabunPSK"/>
+                <w:sz w:val="32"/>
+                <w:szCs w:val="32"/>
+                <w:cs/>
+              </w:rPr>
+              <w:t>ล (</w:t>
+            </w:r>
+            <w:r>
+              <w:rPr>
+                <w:rFonts w:ascii="TH SarabunPSK" w:hAnsi="TH SarabunPSK" w:cs="TH SarabunPSK"/>
+                <w:sz w:val="32"/>
+                <w:szCs w:val="32"/>
+              </w:rPr>
+              <w:t>Sample Data)</w:t>
+            </w:r>
+          </w:p>
+        </w:tc>
+        <w:tc>
+          <w:tcPr>
+            <w:tcW w:type="dxa" w:w="1800"/>
+          </w:tcPr>
+          <w:p>
+            <w:r>
+              <w:rPr>
+                <w:b/>
+              </w:rPr>
+              <w:t>จำเป็น (Required)</w:t>
+            </w:r>
+          </w:p>
+        </w:tc>
+      </w:tr>
+      <w:tr>
+        <w:trPr>
+          <w:cnfStyle w:val="000000100000" w:firstRow="0" w:lastRow="0" w:firstColumn="0" w:lastColumn="0" w:oddVBand="0" w:evenVBand="0" w:oddHBand="1" w:evenHBand="0" w:firstRowFirstColumn="0" w:firstRowLastColumn="0" w:lastRowFirstColumn="0" w:lastRowLastColumn="0"/>
+        </w:trPr>
+        <w:tc>
+          <w:tcPr>
+            <w:cnfStyle w:val="001000000000" w:firstRow="0" w:lastRow="0" w:firstColumn="1" w:lastColumn="0" w:oddVBand="0" w:evenVBand="0" w:oddHBand="0" w:evenHBand="0" w:firstRowFirstColumn="0" w:firstRowLastColumn="0" w:lastRowFirstColumn="0" w:lastRowLastColumn="0"/>
+            <w:tcW w:w="1189" w:type="pct"/>
+          </w:tcPr>
+          <w:p>
+            <w:pPr>
+              <w:rPr>
+                <w:rFonts w:ascii="TH SarabunPSK" w:hAnsi="TH SarabunPSK" w:cs="TH SarabunPSK"/>
+                <w:sz w:val="32"/>
+                <w:szCs w:val="32"/>
+              </w:rPr>
+            </w:pPr>
+            <w:proofErr w:type="spellStart"/>
+            <w:r>
+              <w:rPr>
+                <w:rFonts w:ascii="TH SarabunPSK" w:hAnsi="TH SarabunPSK" w:cs="TH SarabunPSK"/>
+                <w:sz w:val="32"/>
+                <w:szCs w:val="32"/>
+              </w:rPr>
+              <w:t>id</w:t>
+            </w:r>
+            <w:proofErr w:type="spellEnd"/>
+          </w:p>
+        </w:tc>
+        <w:tc>
+          <w:tcPr>
+            <w:tcW w:w="1042" w:type="pct"/>
+          </w:tcPr>
+          <w:p>
+            <w:pPr>
+              <w:jc w:val="center"/>
+              <w:cnfStyle w:val="000000100000" w:firstRow="0" w:lastRow="0" w:firstColumn="0" w:lastColumn="0" w:oddVBand="0" w:evenVBand="0" w:oddHBand="1" w:evenHBand="0" w:firstRowFirstColumn="0" w:firstRowLastColumn="0" w:lastRowFirstColumn="0" w:lastRowLastColumn="0"/>
+              <w:rPr>
+                <w:rFonts w:ascii="TH SarabunPSK" w:hAnsi="TH SarabunPSK" w:cs="TH SarabunPSK"/>
+                <w:sz w:val="32"/>
+                <w:szCs w:val="32"/>
+              </w:rPr>
+            </w:pPr>
+            <w:r>
+              <w:rPr>
+                <w:rFonts w:ascii="TH SarabunPSK" w:hAnsi="TH SarabunPSK" w:cs="TH SarabunPSK" w:hint="cs"/>
+                <w:sz w:val="32"/>
+                <w:szCs w:val="32"/>
+              </w:rPr>
+              <w:t>String</w:t>
+            </w:r>
+          </w:p>
+        </w:tc>
+        <w:tc>
+          <w:tcPr>
+            <w:tcW w:w="1549" w:type="pct"/>
+          </w:tcPr>
+          <w:p>
+            <w:pPr>
+              <w:cnfStyle w:val="000000100000" w:firstRow="0" w:lastRow="0" w:firstColumn="0" w:lastColumn="0" w:oddVBand="0" w:evenVBand="0" w:oddHBand="1" w:evenHBand="0" w:firstRowFirstColumn="0" w:firstRowLastColumn="0" w:lastRowFirstColumn="0" w:lastRowLastColumn="0"/>
+              <w:rPr>
+                <w:rFonts w:ascii="TH SarabunPSK" w:hAnsi="TH SarabunPSK" w:cs="TH SarabunPSK"/>
+                <w:sz w:val="32"/>
+                <w:szCs w:val="32"/>
+              </w:rPr>
+            </w:pPr>
+            <w:r>
+              <w:rPr>
+                <w:rFonts w:ascii="TH SarabunPSK" w:hAnsi="TH SarabunPSK" w:cs="TH SarabunPSK" w:hint="cs"/>
+                <w:sz w:val="32"/>
+                <w:szCs w:val="32"/>
+                <w:cs/>
+              </w:rPr>
+              <w:t>รหัสแผนก — ระบบของเราจะส่งค่านี้กลับเป็น base_department_id ตอนพยาบาลยืนยัน</w:t>
+            </w:r>
+            <w:r>
+              <w:rPr>
+                <w:rFonts w:ascii="TH SarabunPSK" w:hAnsi="TH SarabunPSK" w:cs="TH SarabunPSK" w:hint="cs"/>
+                <w:sz w:val="32"/>
+                <w:szCs w:val="32"/>
+              </w:rPr>
+            </w:r>
+          </w:p>
+        </w:tc>
+        <w:tc>
+          <w:tcPr>
+            <w:tcW w:w="1220" w:type="pct"/>
+          </w:tcPr>
+          <w:p>
+            <w:pPr>
+              <w:cnfStyle w:val="000000100000" w:firstRow="0" w:lastRow="0" w:firstColumn="0" w:lastColumn="0" w:oddVBand="0" w:evenVBand="0" w:oddHBand="1" w:evenHBand="0" w:firstRowFirstColumn="0" w:firstRowLastColumn="0" w:lastRowFirstColumn="0" w:lastRowLastColumn="0"/>
+              <w:rPr>
+                <w:rFonts w:ascii="TH SarabunPSK" w:hAnsi="TH SarabunPSK" w:cs="TH SarabunPSK" w:hint="cs"/>
+                <w:sz w:val="32"/>
+                <w:szCs w:val="32"/>
+                <w:cs/>
+              </w:rPr>
+            </w:pPr>
+            <w:r>
+              <w:t>DEPT_MED</w:t>
+            </w:r>
+          </w:p>
+        </w:tc>
+        <w:tc>
+          <w:tcPr>
+            <w:tcW w:type="dxa" w:w="1800"/>
+          </w:tcPr>
+          <w:p>
+            <w:r>
+              <w:rPr>
+                <w:b w:val="0"/>
+              </w:rPr>
+              <w:t>Y</w:t>
+            </w:r>
+          </w:p>
+        </w:tc>
+      </w:tr>
+      <w:tr>
+        <w:tc>
+          <w:tcPr>
+            <w:cnfStyle w:val="001000000000" w:firstRow="0" w:lastRow="0" w:firstColumn="1" w:lastColumn="0" w:oddVBand="0" w:evenVBand="0" w:oddHBand="0" w:evenHBand="0" w:firstRowFirstColumn="0" w:firstRowLastColumn="0" w:lastRowFirstColumn="0" w:lastRowLastColumn="0"/>
+            <w:tcW w:w="1189" w:type="pct"/>
+          </w:tcPr>
+          <w:p>
+            <w:pPr>
+              <w:rPr>
+                <w:rFonts w:ascii="TH SarabunPSK" w:hAnsi="TH SarabunPSK" w:cs="TH SarabunPSK"/>
+                <w:sz w:val="32"/>
+                <w:szCs w:val="32"/>
+              </w:rPr>
+            </w:pPr>
+            <w:r>
+              <w:rPr>
+                <w:rFonts w:ascii="TH SarabunPSK" w:hAnsi="TH SarabunPSK" w:cs="TH SarabunPSK"/>
+                <w:sz w:val="32"/>
+                <w:szCs w:val="32"/>
+              </w:rPr>
+              <w:t>name</w:t>
+            </w:r>
+            <w:r>
+              <w:rPr>
+                <w:rFonts w:ascii="TH SarabunPSK" w:hAnsi="TH SarabunPSK" w:cs="TH SarabunPSK" w:hint="cs"/>
+                <w:sz w:val="32"/>
+                <w:szCs w:val="32"/>
+              </w:rPr>
+            </w:r>
+          </w:p>
+        </w:tc>
+        <w:tc>
+          <w:tcPr>
+            <w:tcW w:w="1042" w:type="pct"/>
+          </w:tcPr>
+          <w:p>
+            <w:pPr>
+              <w:jc w:val="center"/>
+              <w:cnfStyle w:val="000000000000" w:firstRow="0" w:lastRow="0" w:firstColumn="0" w:lastColumn="0" w:oddVBand="0" w:evenVBand="0" w:oddHBand="0" w:evenHBand="0" w:firstRowFirstColumn="0" w:firstRowLastColumn="0" w:lastRowFirstColumn="0" w:lastRowLastColumn="0"/>
+              <w:rPr>
+                <w:rFonts w:ascii="TH SarabunPSK" w:hAnsi="TH SarabunPSK" w:cs="TH SarabunPSK"/>
+                <w:sz w:val="32"/>
+                <w:szCs w:val="32"/>
+              </w:rPr>
+            </w:pPr>
+            <w:r>
+              <w:rPr>
+                <w:rFonts w:ascii="TH SarabunPSK" w:hAnsi="TH SarabunPSK" w:cs="TH SarabunPSK" w:hint="cs"/>
+                <w:sz w:val="32"/>
+                <w:szCs w:val="32"/>
+              </w:rPr>
+              <w:t>String</w:t>
+            </w:r>
+          </w:p>
+        </w:tc>
+        <w:tc>
+          <w:tcPr>
+            <w:tcW w:w="1549" w:type="pct"/>
+          </w:tcPr>
+          <w:p>
+            <w:pPr>
+              <w:cnfStyle w:val="000000000000" w:firstRow="0" w:lastRow="0" w:firstColumn="0" w:lastColumn="0" w:oddVBand="0" w:evenVBand="0" w:oddHBand="0" w:evenHBand="0" w:firstRowFirstColumn="0" w:firstRowLastColumn="0" w:lastRowFirstColumn="0" w:lastRowLastColumn="0"/>
+              <w:rPr>
+                <w:rFonts w:ascii="TH SarabunPSK" w:hAnsi="TH SarabunPSK" w:cs="TH SarabunPSK"/>
+                <w:sz w:val="32"/>
+                <w:szCs w:val="32"/>
+              </w:rPr>
+            </w:pPr>
+            <w:r>
+              <w:rPr>
+                <w:rFonts w:ascii="TH SarabunPSK" w:hAnsi="TH SarabunPSK" w:cs="TH SarabunPSK" w:hint="cs"/>
+                <w:sz w:val="32"/>
+                <w:szCs w:val="32"/>
+                <w:cs/>
+              </w:rPr>
+              <w:t>ชื่อแผนก — ใช้แสดงให้พยาบาล และใช้ตรวจสอบว่ารหัสยังตรงกับแผนกเดิม</w:t>
+            </w:r>
+          </w:p>
+        </w:tc>
+        <w:tc>
+          <w:tcPr>
+            <w:tcW w:w="1220" w:type="pct"/>
+          </w:tcPr>
+          <w:p>
+            <w:pPr>
+              <w:cnfStyle w:val="000000000000" w:firstRow="0" w:lastRow="0" w:firstColumn="0" w:lastColumn="0" w:oddVBand="0" w:evenVBand="0" w:oddHBand="0" w:evenHBand="0" w:firstRowFirstColumn="0" w:firstRowLastColumn="0" w:lastRowFirstColumn="0" w:lastRowLastColumn="0"/>
+              <w:rPr>
+                <w:rFonts w:ascii="TH SarabunPSK" w:hAnsi="TH SarabunPSK" w:cs="TH SarabunPSK" w:hint="cs"/>
+                <w:sz w:val="32"/>
+                <w:szCs w:val="32"/>
+                <w:cs/>
+              </w:rPr>
+            </w:pPr>
+            <w:r>
+              <w:t>แผนก OPD MED (อายุรกรรม)</w:t>
+            </w:r>
+          </w:p>
+        </w:tc>
+        <w:tc>
+          <w:tcPr>
+            <w:tcW w:type="dxa" w:w="1800"/>
+          </w:tcPr>
+          <w:p>
+            <w:r>
+              <w:rPr>
+                <w:b w:val="0"/>
+              </w:rPr>
+              <w:t>Y</w:t>
+            </w:r>
+          </w:p>
+        </w:tc>
+      </w:tr>
+      <w:tr>
+        <w:trPr>
+          <w:cnfStyle w:val="000000100000" w:firstRow="0" w:lastRow="0" w:firstColumn="0" w:lastColumn="0" w:oddVBand="0" w:evenVBand="0" w:oddHBand="1" w:evenHBand="0" w:firstRowFirstColumn="0" w:firstRowLastColumn="0" w:lastRowFirstColumn="0" w:lastRowLastColumn="0"/>
+        </w:trPr>
+        <w:tc>
+          <w:tcPr>
+            <w:cnfStyle w:val="001000000000" w:firstRow="0" w:lastRow="0" w:firstColumn="1" w:lastColumn="0" w:oddVBand="0" w:evenVBand="0" w:oddHBand="0" w:evenHBand="0" w:firstRowFirstColumn="0" w:firstRowLastColumn="0" w:lastRowFirstColumn="0" w:lastRowLastColumn="0"/>
+            <w:tcW w:w="1189" w:type="pct"/>
+          </w:tcPr>
+          <w:p>
+            <w:pPr>
+              <w:rPr>
+                <w:rFonts w:ascii="TH SarabunPSK" w:hAnsi="TH SarabunPSK" w:cs="TH SarabunPSK"/>
+                <w:sz w:val="32"/>
+                <w:szCs w:val="32"/>
+              </w:rPr>
+            </w:pPr>
+            <w:r>
+              <w:rPr>
+                <w:rFonts w:ascii="TH SarabunPSK" w:hAnsi="TH SarabunPSK" w:cs="TH SarabunPSK"/>
+                <w:sz w:val="32"/>
+                <w:szCs w:val="32"/>
+              </w:rPr>
+              <w:t>active</w:t>
+            </w:r>
+            <w:r>
+              <w:rPr>
+                <w:rFonts w:ascii="TH SarabunPSK" w:hAnsi="TH SarabunPSK" w:cs="TH SarabunPSK" w:hint="cs"/>
+                <w:sz w:val="32"/>
+                <w:szCs w:val="32"/>
+              </w:rPr>
+            </w:r>
+          </w:p>
+        </w:tc>
+        <w:tc>
+          <w:tcPr>
+            <w:tcW w:w="1042" w:type="pct"/>
+          </w:tcPr>
+          <w:p>
+            <w:pPr>
+              <w:jc w:val="center"/>
+              <w:cnfStyle w:val="000000100000" w:firstRow="0" w:lastRow="0" w:firstColumn="0" w:lastColumn="0" w:oddVBand="0" w:evenVBand="0" w:oddHBand="1" w:evenHBand="0" w:firstRowFirstColumn="0" w:firstRowLastColumn="0" w:lastRowFirstColumn="0" w:lastRowLastColumn="0"/>
+              <w:rPr>
+                <w:rFonts w:ascii="TH SarabunPSK" w:hAnsi="TH SarabunPSK" w:cs="TH SarabunPSK"/>
+                <w:sz w:val="32"/>
+                <w:szCs w:val="32"/>
+              </w:rPr>
+            </w:pPr>
+            <w:r>
+              <w:rPr>
+                <w:rFonts w:ascii="TH SarabunPSK" w:hAnsi="TH SarabunPSK" w:cs="TH SarabunPSK" w:hint="cs"/>
+                <w:sz w:val="32"/>
+                <w:szCs w:val="32"/>
+              </w:rPr>
+              <w:t>Boolean</w:t>
+            </w:r>
+          </w:p>
+        </w:tc>
+        <w:tc>
+          <w:tcPr>
+            <w:tcW w:w="1549" w:type="pct"/>
+          </w:tcPr>
+          <w:p>
+            <w:pPr>
+              <w:cnfStyle w:val="000000100000" w:firstRow="0" w:lastRow="0" w:firstColumn="0" w:lastColumn="0" w:oddVBand="0" w:evenVBand="0" w:oddHBand="1" w:evenHBand="0" w:firstRowFirstColumn="0" w:firstRowLastColumn="0" w:lastRowFirstColumn="0" w:lastRowLastColumn="0"/>
+              <w:rPr>
+                <w:rFonts w:ascii="TH SarabunPSK" w:hAnsi="TH SarabunPSK" w:cs="TH SarabunPSK"/>
+                <w:sz w:val="32"/>
+                <w:szCs w:val="32"/>
+              </w:rPr>
+            </w:pPr>
+            <w:r>
+              <w:rPr>
+                <w:rFonts w:ascii="TH SarabunPSK" w:hAnsi="TH SarabunPSK" w:cs="TH SarabunPSK" w:hint="cs"/>
+                <w:sz w:val="32"/>
+                <w:szCs w:val="32"/>
+                <w:cs/>
+              </w:rPr>
+              <w:t>สถานะเปิดให้บริการ (ถ้ามี) — เพื่อไม่ส่งผู้ป่วยไปยังแผนกที่ยกเลิกแล้ว</w:t>
+            </w:r>
+          </w:p>
+        </w:tc>
+        <w:tc>
+          <w:tcPr>
+            <w:tcW w:w="1220" w:type="pct"/>
+          </w:tcPr>
+          <w:p>
+            <w:pPr>
+              <w:cnfStyle w:val="000000100000" w:firstRow="0" w:lastRow="0" w:firstColumn="0" w:lastColumn="0" w:oddVBand="0" w:evenVBand="0" w:oddHBand="1" w:evenHBand="0" w:firstRowFirstColumn="0" w:firstRowLastColumn="0" w:lastRowFirstColumn="0" w:lastRowLastColumn="0"/>
+              <w:rPr>
+                <w:rFonts w:ascii="TH SarabunPSK" w:hAnsi="TH SarabunPSK" w:cs="TH SarabunPSK" w:hint="cs"/>
+                <w:sz w:val="32"/>
+                <w:szCs w:val="32"/>
+                <w:cs/>
+              </w:rPr>
+            </w:pPr>
+            <w:r>
+              <w:t>true</w:t>
+            </w:r>
+          </w:p>
+        </w:tc>
+        <w:tc>
+          <w:tcPr>
+            <w:tcW w:type="dxa" w:w="1800"/>
+          </w:tcPr>
+          <w:p>
+            <w:r>
+              <w:rPr>
+                <w:b w:val="0"/>
+              </w:rPr>
+              <w:t>N</w:t>
+            </w:r>
+          </w:p>
+        </w:tc>
+      </w:tr>
+    </w:tbl>
+    <w:p>
+      <w:r>
+        <w:rPr>
+          <w:b w:val="0"/>
+          <w:i/>
+        </w:rPr>
+        <w:t>หมายเหตุ: ระบบของเราส่งต่อผู้ป่วยในระดับ 'แผนก' เท่านั้น ไม่ได้ระบุจุดบริการ (service point) หรือแพทย์ผู้ตรวจ จึงขอข้อมูล 2 ส่วน — (1) รายชื่อแผนกทั้งหมด พร้อมรหัส เป็นไฟล์รายการครั้งแรก ซึ่งจำเป็นต้องได้รับก่อนเริ่มใช้งาน เพราะการจับคู่แผนก ของระบบเรากับรหัสของโรงพยาบาลต้องทำโดยเจ้าหน้าที่ครั้งเดียว และ (2) API สำหรับดึง รายการนี้ เพื่อปรับข้อมูลให้เป็นปัจจุบันเมื่อมีการเพิ่ม เปลี่ยนชื่อ หรือยกเลิกแผนก ระบบจะเรียกเป็นครั้งคราวเท่านั้น ไม่ได้เรียกทุกครั้งที่มีผู้ป่วย</w:t>
+      </w:r>
+    </w:p>
+    <w:p>
+      <w:r>
+        <w:rPr>
+          <w:b/>
+          <w:i/>
+        </w:rPr>
+        <w:t>ตัวอย่าง JSON — GET — รายชื่อแผนก</w:t>
+      </w:r>
+    </w:p>
+    <w:p>
+      <w:r>
+        <w:rPr>
+          <w:rFonts w:ascii="Consolas" w:hAnsi="Consolas"/>
+          <w:b w:val="0"/>
+          <w:i w:val="0"/>
+          <w:color w:val="1F3A5F"/>
+          <w:sz w:val="18"/>
+        </w:rPr>
+        <w:t>{</w:t>
+        <w:br/>
+        <w:t xml:space="preserve">  "departments": [</w:t>
+        <w:br/>
+        <w:t xml:space="preserve">    { "id": "DEPT_MED", "name": "แผนก OPD MED (อายุรกรรม)", "active": true },</w:t>
+        <w:br/>
+        <w:t xml:space="preserve">    { "id": "DEPT_ENT", "name": "แผนก OPD E.N.T (หู คอ จมูก)", "active": true },</w:t>
+        <w:br/>
+        <w:t xml:space="preserve">    { "id": "DEPT_ER",  "name": "แผนก ER (อุบัติเหตุและฉุกเฉิน)", "active": true }</w:t>
+        <w:br/>
+        <w:t xml:space="preserve">  ]</w:t>
+        <w:br/>
+        <w:t>}</w:t>
+      </w:r>
     </w:p>
     <w:sectPr>
       <w:pgSz w:w="12240" w:h="15840"/>

</xml_diff>

<commit_message>
docs: label both department sections by direction, and use the real field name
2.2 and 3.1 read like the same table but point opposite ways: 2.2 is the
department we POST when a nurse confirms, 3.1 is the master list we GET so
we can pick a valid id in the first place. Both headings now say which.

2.2 also used id_of_department, a name that exists nowhere in the API — the
assignment sends base_department_id. Renamed, and name_of_department now
says outright that we do not send it; it is there so a reader can tell which
department the code means.

Co-Authored-By: Claude Opus 5 <noreply@anthropic.com>
Claude-Session: https://claude.ai/code/session_013jGr64EsyUjwXguxfZMkqs
</commit_message>
<xml_diff>
--- a/docs/data-requirements-hospital.docx
+++ b/docs/data-requirements-hospital.docx
@@ -4546,8 +4546,7 @@
           <w:szCs w:val="32"/>
           <w:cs/>
         </w:rPr>
-        <w:tab/>
-        <w:t xml:space="preserve">2.2. </w:t>
+        <w:t>2.2. ข้อมูลเกี่ยวกับแผนกการรักษา (Department Information) — ข้อมูลที่เราส่งให้โรงพยาบาล</w:t>
       </w:r>
       <w:r>
         <w:rPr>
@@ -4556,7 +4555,6 @@
           <w:szCs w:val="32"/>
           <w:cs/>
         </w:rPr>
-        <w:t>ข้อมูล</w:t>
       </w:r>
       <w:r>
         <w:rPr>
@@ -4565,7 +4563,6 @@
           <w:szCs w:val="32"/>
           <w:cs/>
         </w:rPr>
-        <w:t>เกี่ยวกับแผนกการรักษา</w:t>
       </w:r>
       <w:r>
         <w:rPr>
@@ -4574,7 +4571,6 @@
           <w:szCs w:val="32"/>
           <w:cs/>
         </w:rPr>
-        <w:t xml:space="preserve"> </w:t>
       </w:r>
       <w:r>
         <w:rPr>
@@ -4582,7 +4578,6 @@
           <w:sz w:val="32"/>
           <w:szCs w:val="32"/>
         </w:rPr>
-        <w:t>(Department Information)</w:t>
       </w:r>
     </w:p>
     <w:tbl>
@@ -4841,7 +4836,7 @@
                 <w:sz w:val="32"/>
                 <w:szCs w:val="32"/>
               </w:rPr>
-              <w:t>name_of_department</w:t>
+              <w:t>base_department_id</w:t>
             </w:r>
             <w:r>
               <w:rPr>
@@ -4935,7 +4930,7 @@
                 <w:cs/>
                 <w:lang w:eastAsia="ja-JP"/>
               </w:rPr>
-              <w:t>ชื่อแผนกการรักษา</w:t>
+              <w:t>รหัสแผนกปลายทางที่ระบบเราส่งให้ตอนพยาบาลยืนยัน (ขั้นที่ 2) — เลือกจากรายชื่อแผนกในข้อ 3.1</w:t>
             </w:r>
           </w:p>
         </w:tc>
@@ -4955,7 +4950,7 @@
               </w:rPr>
             </w:pPr>
             <w:r>
-              <w:t>แผนก OPD MED (อายุรกรรม)</w:t>
+              <w:t>DEPT_MED</w:t>
             </w:r>
           </w:p>
         </w:tc>
@@ -4968,7 +4963,7 @@
               <w:rPr>
                 <w:b w:val="0"/>
               </w:rPr>
-              <w:t>N</w:t>
+              <w:t>Y</w:t>
             </w:r>
           </w:p>
         </w:tc>
@@ -4994,31 +4989,28 @@
                 <w:sz w:val="32"/>
                 <w:szCs w:val="32"/>
               </w:rPr>
-              <w:t>id_</w:t>
-            </w:r>
-            <w:r>
-              <w:rPr>
-                <w:rFonts w:ascii="TH SarabunPSK" w:hAnsi="TH SarabunPSK" w:cs="TH SarabunPSK"/>
-                <w:sz w:val="32"/>
-                <w:szCs w:val="32"/>
-              </w:rPr>
-              <w:t>of</w:t>
-            </w:r>
-            <w:r>
-              <w:rPr>
-                <w:rFonts w:ascii="TH SarabunPSK" w:hAnsi="TH SarabunPSK" w:cs="TH SarabunPSK"/>
-                <w:sz w:val="32"/>
-                <w:szCs w:val="32"/>
-              </w:rPr>
-              <w:t>_d</w:t>
-            </w:r>
-            <w:r>
-              <w:rPr>
-                <w:rFonts w:ascii="TH SarabunPSK" w:hAnsi="TH SarabunPSK" w:cs="TH SarabunPSK"/>
-                <w:sz w:val="32"/>
-                <w:szCs w:val="32"/>
-              </w:rPr>
-              <w:t>epartment</w:t>
+              <w:t>name_of_department</w:t>
+            </w:r>
+            <w:r>
+              <w:rPr>
+                <w:rFonts w:ascii="TH SarabunPSK" w:hAnsi="TH SarabunPSK" w:cs="TH SarabunPSK"/>
+                <w:sz w:val="32"/>
+                <w:szCs w:val="32"/>
+              </w:rPr>
+            </w:r>
+            <w:r>
+              <w:rPr>
+                <w:rFonts w:ascii="TH SarabunPSK" w:hAnsi="TH SarabunPSK" w:cs="TH SarabunPSK"/>
+                <w:sz w:val="32"/>
+                <w:szCs w:val="32"/>
+              </w:rPr>
+            </w:r>
+            <w:r>
+              <w:rPr>
+                <w:rFonts w:ascii="TH SarabunPSK" w:hAnsi="TH SarabunPSK" w:cs="TH SarabunPSK"/>
+                <w:sz w:val="32"/>
+                <w:szCs w:val="32"/>
+              </w:rPr>
             </w:r>
             <w:proofErr w:type="spellEnd"/>
           </w:p>
@@ -5066,16 +5058,15 @@
                 <w:sz w:val="32"/>
                 <w:szCs w:val="32"/>
               </w:rPr>
-              <w:t xml:space="preserve">ID </w:t>
-            </w:r>
-            <w:r>
-              <w:rPr>
-                <w:rFonts w:ascii="TH SarabunPSK" w:hAnsi="TH SarabunPSK" w:cs="TH SarabunPSK"/>
-                <w:sz w:val="32"/>
-                <w:szCs w:val="32"/>
-                <w:cs/>
-              </w:rPr>
-              <w:t>ของแผนกการรักษา</w:t>
+              <w:t>ชื่อแผนก — ระบบเราไม่ได้ส่งค่านี้ ใส่ไว้เพื่ออ้างอิงว่ารหัสข้างต้นคือแผนกใด (ชื่อมาจากรายชื่อแผนกในข้อ 3.1)</w:t>
+            </w:r>
+            <w:r>
+              <w:rPr>
+                <w:rFonts w:ascii="TH SarabunPSK" w:hAnsi="TH SarabunPSK" w:cs="TH SarabunPSK"/>
+                <w:sz w:val="32"/>
+                <w:szCs w:val="32"/>
+                <w:cs/>
+              </w:rPr>
             </w:r>
           </w:p>
         </w:tc>
@@ -5093,7 +5084,7 @@
               </w:rPr>
             </w:pPr>
             <w:r>
-              <w:t>DEPT_MED</w:t>
+              <w:t>แผนก OPD MED (อายุรกรรม)</w:t>
             </w:r>
           </w:p>
         </w:tc>
@@ -5106,7 +5097,7 @@
               <w:rPr>
                 <w:b w:val="0"/>
               </w:rPr>
-              <w:t>Y</w:t>
+              <w:t>N</w:t>
             </w:r>
           </w:p>
         </w:tc>
@@ -5118,7 +5109,7 @@
           <w:b/>
           <w:i/>
         </w:rPr>
-        <w:t>ตัวอย่าง JSON — แผนกปลายทาง (ส่งในขั้นที่ 2 หลังพยาบาลยืนยัน)</w:t>
+        <w:t>ตัวอย่าง JSON — POST — แผนกปลายทาง (ส่งในขั้นที่ 2 หลังพยาบาลยืนยัน) ค่ารหัสแผนกมาจากรายชื่อในข้อ 3.1</w:t>
       </w:r>
     </w:p>
     <w:p>
@@ -5132,9 +5123,7 @@
         </w:rPr>
         <w:t>{</w:t>
         <w:br/>
-        <w:t xml:space="preserve">  "id_of_department": "DEPT_MED",</w:t>
-        <w:br/>
-        <w:t xml:space="preserve">  "name_of_department": "แผนก OPD MED (อายุรกรรม)"</w:t>
+        <w:t xml:space="preserve">  "base_department_id": "DEPT_MED"</w:t>
         <w:br/>
         <w:t>}</w:t>
       </w:r>
@@ -7721,7 +7710,7 @@
           <w:szCs w:val="32"/>
           <w:cs/>
         </w:rPr>
-        <w:t>3.1. รายชื่อแผนกทั้งหมดและรหัสแผนก (Department List)</w:t>
+        <w:t>3.1. รายชื่อแผนกทั้งหมดและรหัสแผนก (Department List) — ข้อมูลที่เราขอรับจากโรงพยาบาล</w:t>
       </w:r>
       <w:r>
         <w:rPr>

</xml_diff>

<commit_message>
docs: appendix with the real payloads, and fix the field names that were wrong
The docx and the Postman collection described the same integration in two
vocabularies — the docx in the hospital's Prescreen export columns, Postman
in our wire fields — with nothing saying so. A reader comparing them sees
contradictions.

New appendix 4 carries the two payloads we actually send, extracted from the
collection itself rather than retyped, plus 4.3 mapping each export column
to the field that fills it. 2.1 now says which vocabulary its table uses.

Three names in section 1 were simply wrong and would have been coded to:
name -> patient_name, birthday -> birthdate, recorded_time -> recorded_at.
Fixed in the tables and the JSON examples.

Co-Authored-By: Claude Opus 5 <noreply@anthropic.com>
Claude-Session: https://claude.ai/code/session_013jGr64EsyUjwXguxfZMkqs
</commit_message>
<xml_diff>
--- a/docs/data-requirements-hospital.docx
+++ b/docs/data-requirements-hospital.docx
@@ -815,15 +815,14 @@
                 <w:sz w:val="32"/>
                 <w:szCs w:val="32"/>
               </w:rPr>
-              <w:t>n</w:t>
-            </w:r>
-            <w:r>
-              <w:rPr>
-                <w:rFonts w:ascii="TH SarabunPSK" w:hAnsi="TH SarabunPSK" w:cs="TH SarabunPSK" w:hint="cs"/>
-                <w:sz w:val="32"/>
-                <w:szCs w:val="32"/>
-              </w:rPr>
-              <w:t>ame</w:t>
+              <w:t>patient_name</w:t>
+            </w:r>
+            <w:r>
+              <w:rPr>
+                <w:rFonts w:ascii="TH SarabunPSK" w:hAnsi="TH SarabunPSK" w:cs="TH SarabunPSK" w:hint="cs"/>
+                <w:sz w:val="32"/>
+                <w:szCs w:val="32"/>
+              </w:rPr>
             </w:r>
           </w:p>
         </w:tc>
@@ -931,15 +930,14 @@
                 <w:sz w:val="32"/>
                 <w:szCs w:val="32"/>
               </w:rPr>
-              <w:t>b</w:t>
-            </w:r>
-            <w:r>
-              <w:rPr>
-                <w:rFonts w:ascii="TH SarabunPSK" w:hAnsi="TH SarabunPSK" w:cs="TH SarabunPSK" w:hint="cs"/>
-                <w:sz w:val="32"/>
-                <w:szCs w:val="32"/>
-              </w:rPr>
-              <w:t xml:space="preserve">irthday </w:t>
+              <w:t>birthdate</w:t>
+            </w:r>
+            <w:r>
+              <w:rPr>
+                <w:rFonts w:ascii="TH SarabunPSK" w:hAnsi="TH SarabunPSK" w:cs="TH SarabunPSK" w:hint="cs"/>
+                <w:sz w:val="32"/>
+                <w:szCs w:val="32"/>
+              </w:rPr>
             </w:r>
           </w:p>
         </w:tc>
@@ -1188,9 +1186,9 @@
         <w:br/>
         <w:t xml:space="preserve">  "hn": "09900001",</w:t>
         <w:br/>
-        <w:t xml:space="preserve">  "name": "สมชาย ใจดี",</w:t>
-        <w:br/>
-        <w:t xml:space="preserve">  "birthday": "1968-03-14",</w:t>
+        <w:t xml:space="preserve">  "patient_name": "สมชาย ใจดี",</w:t>
+        <w:br/>
+        <w:t xml:space="preserve">  "birthdate": "1968-03-14",</w:t>
         <w:br/>
         <w:t xml:space="preserve">  "is_first_time": false</w:t>
         <w:br/>
@@ -2302,31 +2300,28 @@
                 <w:sz w:val="32"/>
                 <w:szCs w:val="32"/>
               </w:rPr>
-              <w:t>r</w:t>
-            </w:r>
-            <w:r>
-              <w:rPr>
-                <w:rFonts w:ascii="TH SarabunPSK" w:hAnsi="TH SarabunPSK" w:cs="TH SarabunPSK"/>
-                <w:sz w:val="32"/>
-                <w:szCs w:val="32"/>
-              </w:rPr>
-              <w:t>ecorded</w:t>
-            </w:r>
-            <w:r>
-              <w:rPr>
-                <w:rFonts w:ascii="TH SarabunPSK" w:hAnsi="TH SarabunPSK" w:cs="TH SarabunPSK"/>
-                <w:sz w:val="32"/>
-                <w:szCs w:val="32"/>
-              </w:rPr>
-              <w:t>_</w:t>
-            </w:r>
-            <w:r>
-              <w:rPr>
-                <w:rFonts w:ascii="TH SarabunPSK" w:hAnsi="TH SarabunPSK" w:cs="TH SarabunPSK" w:hint="cs"/>
-                <w:sz w:val="32"/>
-                <w:szCs w:val="32"/>
-              </w:rPr>
-              <w:t>time</w:t>
+              <w:t>recorded_at</w:t>
+            </w:r>
+            <w:r>
+              <w:rPr>
+                <w:rFonts w:ascii="TH SarabunPSK" w:hAnsi="TH SarabunPSK" w:cs="TH SarabunPSK"/>
+                <w:sz w:val="32"/>
+                <w:szCs w:val="32"/>
+              </w:rPr>
+            </w:r>
+            <w:r>
+              <w:rPr>
+                <w:rFonts w:ascii="TH SarabunPSK" w:hAnsi="TH SarabunPSK" w:cs="TH SarabunPSK"/>
+                <w:sz w:val="32"/>
+                <w:szCs w:val="32"/>
+              </w:rPr>
+            </w:r>
+            <w:r>
+              <w:rPr>
+                <w:rFonts w:ascii="TH SarabunPSK" w:hAnsi="TH SarabunPSK" w:cs="TH SarabunPSK" w:hint="cs"/>
+                <w:sz w:val="32"/>
+                <w:szCs w:val="32"/>
+              </w:rPr>
             </w:r>
             <w:proofErr w:type="spellEnd"/>
           </w:p>
@@ -2448,7 +2443,7 @@
         <w:br/>
         <w:t xml:space="preserve">  "family_history": "บิดาเป็นโรคหัวใจ",</w:t>
         <w:br/>
-        <w:t xml:space="preserve">  "recorded_time": "2026-02-11T09:20:00+07:00"</w:t>
+        <w:t xml:space="preserve">  "recorded_at": "2026-02-11T09:20:00+07:00"</w:t>
         <w:br/>
         <w:t>}</w:t>
       </w:r>
@@ -3214,6 +3209,15 @@
         <w:t>Vital Signs Measurement)</w:t>
       </w:r>
     </w:p>
+    <w:p>
+      <w:r>
+        <w:rPr>
+          <w:b w:val="0"/>
+          <w:i/>
+        </w:rPr>
+        <w:t>หมายเหตุ: ชื่อพารามิเตอร์ในหัวข้อ 2.x ใช้ตามชื่อคอลัมน์ในไฟล์ Prescreen ของโรงพยาบาล ส่วน payload จริงที่ระบบเราส่งใช้ชื่อฟิลด์ของเราเอง (เช่น temperature_c, pulse_bpm) ตารางเทียบชื่อและตัวอย่าง payload จริงอยู่ในภาคผนวก ข้อ 4</w:t>
+      </w:r>
+    </w:p>
     <w:tbl>
       <w:tblPr>
         <w:tblStyle w:val="GridTable4-Accent1"/>
@@ -4334,7 +4338,7 @@
                 <w:szCs w:val="32"/>
                 <w:cs/>
               </w:rPr>
-              <w:t>อาการหลักที่ทำให้มาโรงพยาบาล</w:t>
+              <w:t>อาการหลักที่ทำให้มาโรงพยาบาล — ส่งในขั้นที่ 2 ภายใน sbar.situation (ดูภาคผนวก 4.2)</w:t>
             </w:r>
           </w:p>
         </w:tc>
@@ -4445,7 +4449,7 @@
                 <w:szCs w:val="32"/>
                 <w:cs/>
               </w:rPr>
-              <w:t>อาการป่วย</w:t>
+              <w:t>อาการป่วย — ส่งในขั้นที่ 2 ภายใน sbar.assessment_problem (ดูภาคผนวก 4.2)</w:t>
             </w:r>
           </w:p>
         </w:tc>
@@ -4489,7 +4493,7 @@
           <w:b/>
           <w:i/>
         </w:rPr>
-        <w:t>ตัวอย่าง JSON — POST — ขั้นที่ 1 (คัดกรองเสร็จ รอพยาบาลยืนยัน) ยังไม่มีแผนกและยังไม่มีผลวินิจฉัย</w:t>
+        <w:t>ตัวอย่าง JSON — ค่าที่บันทึกในขั้นที่ 1 (คัดกรองเสร็จ รอพยาบาลยืนยัน) ยังไม่มีแผนกและยังไม่มีผลวินิจฉัย — แสดงตามชื่อคอลัมน์ Prescreen ส่วน payload จริงที่ระบบส่งอยู่ในภาคผนวก ข้อ 4.1</w:t>
       </w:r>
     </w:p>
     <w:p>
@@ -8363,6 +8367,725 @@
         <w:t>}</w:t>
       </w:r>
     </w:p>
+    <w:p>
+      <w:pPr>
+        <w:pStyle w:val="ListParagraph"/>
+        <w:numPr>
+          <w:ilvl w:val="0"/>
+          <w:numId w:val="3"/>
+        </w:numPr>
+        <w:spacing w:after="0"/>
+        <w:rPr>
+          <w:rFonts w:ascii="TH SarabunPSK" w:hAnsi="TH SarabunPSK" w:cs="TH SarabunPSK"/>
+          <w:b/>
+          <w:bCs/>
+          <w:sz w:val="32"/>
+          <w:szCs w:val="32"/>
+        </w:rPr>
+      </w:pPr>
+      <w:r>
+        <w:rPr>
+          <w:rFonts w:ascii="TH SarabunPSK" w:hAnsi="TH SarabunPSK" w:cs="TH SarabunPSK" w:hint="cs"/>
+          <w:b/>
+          <w:bCs/>
+          <w:sz w:val="32"/>
+          <w:szCs w:val="32"/>
+        </w:rPr>
+        <w:t>ภาคผนวก — Payload จริงจากระบบ (Appendix — Actual Payloads)</w:t>
+      </w:r>
+    </w:p>
+    <w:p>
+      <w:pPr>
+        <w:spacing w:after="0"/>
+        <w:rPr>
+          <w:rFonts w:ascii="TH SarabunPSK" w:hAnsi="TH SarabunPSK" w:cs="TH SarabunPSK"/>
+          <w:sz w:val="32"/>
+          <w:szCs w:val="32"/>
+        </w:rPr>
+      </w:pPr>
+      <w:r>
+        <w:rPr>
+          <w:rFonts w:ascii="TH SarabunPSK" w:hAnsi="TH SarabunPSK" w:cs="TH SarabunPSK" w:hint="cs"/>
+          <w:sz w:val="32"/>
+          <w:szCs w:val="32"/>
+          <w:cs/>
+        </w:rPr>
+        <w:t>4.1. ขั้นที่ 1 — POST /patient-prescreens (หลังคัดกรองเสร็จ ก่อนพยาบาลยืนยัน)</w:t>
+      </w:r>
+      <w:r>
+        <w:rPr>
+          <w:rFonts w:ascii="TH SarabunPSK" w:hAnsi="TH SarabunPSK" w:cs="TH SarabunPSK"/>
+          <w:sz w:val="32"/>
+          <w:szCs w:val="32"/>
+          <w:cs/>
+        </w:rPr>
+      </w:r>
+      <w:r>
+        <w:rPr>
+          <w:rFonts w:ascii="TH SarabunPSK" w:hAnsi="TH SarabunPSK" w:cs="TH SarabunPSK" w:hint="cs"/>
+          <w:sz w:val="32"/>
+          <w:szCs w:val="32"/>
+          <w:cs/>
+        </w:rPr>
+      </w:r>
+      <w:r>
+        <w:rPr>
+          <w:rFonts w:ascii="TH SarabunPSK" w:hAnsi="TH SarabunPSK" w:cs="TH SarabunPSK"/>
+          <w:sz w:val="32"/>
+          <w:szCs w:val="32"/>
+          <w:cs/>
+        </w:rPr>
+      </w:r>
+      <w:r>
+        <w:rPr>
+          <w:rFonts w:ascii="TH SarabunPSK" w:hAnsi="TH SarabunPSK" w:cs="TH SarabunPSK"/>
+          <w:sz w:val="32"/>
+          <w:szCs w:val="32"/>
+        </w:rPr>
+      </w:r>
+    </w:p>
+    <w:p>
+      <w:r>
+        <w:rPr>
+          <w:b/>
+          <w:i/>
+        </w:rPr>
+        <w:t>ตัวอย่าง JSON — ข้อมูลที่วัดได้เท่านั้น ไม่มีแผนก ไม่มีระดับคัดกรอง ไม่มีผลวินิจฉัย</w:t>
+      </w:r>
+    </w:p>
+    <w:p>
+      <w:r>
+        <w:rPr>
+          <w:rFonts w:ascii="Consolas" w:hAnsi="Consolas"/>
+          <w:b w:val="0"/>
+          <w:i w:val="0"/>
+          <w:color w:val="1F3A5F"/>
+          <w:sz w:val="18"/>
+        </w:rPr>
+        <w:t>{</w:t>
+        <w:br/>
+        <w:t xml:space="preserve">  "visit_id": "VISIT_ID_FROM_IMED",</w:t>
+        <w:br/>
+        <w:t xml:space="preserve">  "hn": "09900001",</w:t>
+        <w:br/>
+        <w:t xml:space="preserve">  "session_ref": "1f0b8c2e-4a77-4d1e-9d3a-2b6e5c7f81aa",</w:t>
+        <w:br/>
+        <w:t xml:space="preserve">  "slip_code": "MCH-A1B2-C3D4",</w:t>
+        <w:br/>
+        <w:t xml:space="preserve">  "first_location": {</w:t>
+        <w:br/>
+        <w:t xml:space="preserve">    "id": "AI-BOOTH-01",</w:t>
+        <w:br/>
+        <w:t xml:space="preserve">    "name": "AI Pre-Screening Booth",</w:t>
+        <w:br/>
+        <w:t xml:space="preserve">    "department": "แผนก ผู้ป่วยนอก(หน่วยคัดกรอง)"</w:t>
+        <w:br/>
+        <w:t xml:space="preserve">  },</w:t>
+        <w:br/>
+        <w:t xml:space="preserve">  "measured_at": "2026-08-07T09:12:00+07:00",</w:t>
+        <w:br/>
+        <w:t xml:space="preserve">  "vitals": {</w:t>
+        <w:br/>
+        <w:t xml:space="preserve">    "systolic": 158,</w:t>
+        <w:br/>
+        <w:t xml:space="preserve">    "diastolic": 94,</w:t>
+        <w:br/>
+        <w:t xml:space="preserve">    "pulse_bpm": 96,</w:t>
+        <w:br/>
+        <w:t xml:space="preserve">    "temperature_c": 36.8,</w:t>
+        <w:br/>
+        <w:t xml:space="preserve">    "weight_kg": 72.5,</w:t>
+        <w:br/>
+        <w:t xml:space="preserve">    "height_cm": 165,</w:t>
+        <w:br/>
+        <w:t xml:space="preserve">    "sources": {</w:t>
+        <w:br/>
+        <w:t xml:space="preserve">      "systolic": "device",</w:t>
+        <w:br/>
+        <w:t xml:space="preserve">      "diastolic": "device",</w:t>
+        <w:br/>
+        <w:t xml:space="preserve">      "pulse_bpm": "device",</w:t>
+        <w:br/>
+        <w:t xml:space="preserve">      "temperature_c": "patient_input",</w:t>
+        <w:br/>
+        <w:t xml:space="preserve">      "weight_kg": "patient_input",</w:t>
+        <w:br/>
+        <w:t xml:space="preserve">      "height_cm": "patient_input"</w:t>
+        <w:br/>
+        <w:t xml:space="preserve">    }</w:t>
+        <w:br/>
+        <w:t xml:space="preserve">  }</w:t>
+        <w:br/>
+        <w:t>}</w:t>
+      </w:r>
+    </w:p>
+    <w:p>
+      <w:pPr>
+        <w:spacing w:after="0"/>
+        <w:rPr>
+          <w:rFonts w:ascii="TH SarabunPSK" w:hAnsi="TH SarabunPSK" w:cs="TH SarabunPSK"/>
+          <w:sz w:val="32"/>
+          <w:szCs w:val="32"/>
+        </w:rPr>
+      </w:pPr>
+      <w:r>
+        <w:rPr>
+          <w:rFonts w:ascii="TH SarabunPSK" w:hAnsi="TH SarabunPSK" w:cs="TH SarabunPSK" w:hint="cs"/>
+          <w:sz w:val="32"/>
+          <w:szCs w:val="32"/>
+          <w:cs/>
+        </w:rPr>
+        <w:t>4.2. ขั้นที่ 2 — POST /patient-assignments (หลังพยาบาลยืนยัน)</w:t>
+      </w:r>
+      <w:r>
+        <w:rPr>
+          <w:rFonts w:ascii="TH SarabunPSK" w:hAnsi="TH SarabunPSK" w:cs="TH SarabunPSK"/>
+          <w:sz w:val="32"/>
+          <w:szCs w:val="32"/>
+          <w:cs/>
+        </w:rPr>
+      </w:r>
+      <w:r>
+        <w:rPr>
+          <w:rFonts w:ascii="TH SarabunPSK" w:hAnsi="TH SarabunPSK" w:cs="TH SarabunPSK" w:hint="cs"/>
+          <w:sz w:val="32"/>
+          <w:szCs w:val="32"/>
+          <w:cs/>
+        </w:rPr>
+      </w:r>
+      <w:r>
+        <w:rPr>
+          <w:rFonts w:ascii="TH SarabunPSK" w:hAnsi="TH SarabunPSK" w:cs="TH SarabunPSK"/>
+          <w:sz w:val="32"/>
+          <w:szCs w:val="32"/>
+          <w:cs/>
+        </w:rPr>
+      </w:r>
+      <w:r>
+        <w:rPr>
+          <w:rFonts w:ascii="TH SarabunPSK" w:hAnsi="TH SarabunPSK" w:cs="TH SarabunPSK"/>
+          <w:sz w:val="32"/>
+          <w:szCs w:val="32"/>
+        </w:rPr>
+      </w:r>
+    </w:p>
+    <w:p>
+      <w:r>
+        <w:rPr>
+          <w:b/>
+          <w:i/>
+        </w:rPr>
+        <w:t>ตัวอย่าง JSON — ตาม API contract ของโรงพยาบาล เพิ่ม base_department_id และ hn ส่วน mfu_prescreen คือข้อมูลที่ยังไม่มีช่องรองรับ (คำขอเปลี่ยนแปลงข้อ 1, 2 และ 4)</w:t>
+      </w:r>
+    </w:p>
+    <w:p>
+      <w:r>
+        <w:rPr>
+          <w:rFonts w:ascii="Consolas" w:hAnsi="Consolas"/>
+          <w:b w:val="0"/>
+          <w:i w:val="0"/>
+          <w:color w:val="1F3A5F"/>
+          <w:sz w:val="18"/>
+        </w:rPr>
+        <w:t>{</w:t>
+        <w:br/>
+        <w:t xml:space="preserve">  "request_id": "MFU-20260807-A1B2C3",</w:t>
+        <w:br/>
+        <w:t xml:space="preserve">  "visit_id": "VISIT_ID_FROM_IMED",</w:t>
+        <w:br/>
+        <w:t xml:space="preserve">  "sbar": {</w:t>
+        <w:br/>
+        <w:t xml:space="preserve">    "situation": "แน่นหน้าอกมา 2 ชั่วโมง ร้าวไปแขนซ้าย (อายุ 58 ปี)",</w:t>
+        <w:br/>
+        <w:t xml:space="preserve">    "background": "โรคประจำตัว: ความดันโลหิตสูง | แพ้ยา/แพ้สาร: ไม่มี",</w:t>
+        <w:br/>
+        <w:t xml:space="preserve">    "assessment": "วัดที่บูธ: ความดัน 158/94 ชีพจร 96 อุณหภูมิ 36.8 น้ำหนัก 72.5 กก. ส่วนสูง 165 ซม. | ระดับคัดกรอง 3 (Urgent) | ระดับความเจ็บปวด 6/10",</w:t>
+        <w:br/>
+        <w:t xml:space="preserve">    "assessment_problem": "เจ็บหน้าอกร่วมกับปัจจัยเสี่ยงโรคหัวใจ (คู่มือคัดกรอง MFU ข้อ 4.2)",</w:t>
+        <w:br/>
+        <w:t xml:space="preserve">    "recommend": "ส่งต่อ แผนก OPD MED (อายุรกรรม) | ควรได้รับการตรวจภายใน 30 นาที",</w:t>
+        <w:br/>
+        <w:t xml:space="preserve">    "documentation": "รหัสสลิป MCH-A1B2-C3D4"</w:t>
+        <w:br/>
+        <w:t xml:space="preserve">  },</w:t>
+        <w:br/>
+        <w:t xml:space="preserve">  "base_department_id": "DEPT_MED",</w:t>
+        <w:br/>
+        <w:t xml:space="preserve">  "hn": "09900001",</w:t>
+        <w:br/>
+        <w:t xml:space="preserve">  "mfu_prescreen": {</w:t>
+        <w:br/>
+        <w:t xml:space="preserve">    "triage_level": 3,</w:t>
+        <w:br/>
+        <w:t xml:space="preserve">    "triage_scale": "MOPH-5",</w:t>
+        <w:br/>
+        <w:t xml:space="preserve">    "triage_label": "Urgent",</w:t>
+        <w:br/>
+        <w:t xml:space="preserve">    "vitals": {</w:t>
+        <w:br/>
+        <w:t xml:space="preserve">      "systolic": 158,</w:t>
+        <w:br/>
+        <w:t xml:space="preserve">      "diastolic": 94,</w:t>
+        <w:br/>
+        <w:t xml:space="preserve">      "pulse_bpm": 96,</w:t>
+        <w:br/>
+        <w:t xml:space="preserve">      "temperature_c": 36.8,</w:t>
+        <w:br/>
+        <w:t xml:space="preserve">      "weight_kg": 72.5,</w:t>
+        <w:br/>
+        <w:t xml:space="preserve">      "height_cm": 165,</w:t>
+        <w:br/>
+        <w:t xml:space="preserve">      "measured_at": "2026-08-07T09:12:00+07:00",</w:t>
+        <w:br/>
+        <w:t xml:space="preserve">      "sources": {</w:t>
+        <w:br/>
+        <w:t xml:space="preserve">        "systolic": "device",</w:t>
+        <w:br/>
+        <w:t xml:space="preserve">        "diastolic": "device",</w:t>
+        <w:br/>
+        <w:t xml:space="preserve">        "pulse_bpm": "device",</w:t>
+        <w:br/>
+        <w:t xml:space="preserve">        "temperature_c": "patient_input",</w:t>
+        <w:br/>
+        <w:t xml:space="preserve">        "weight_kg": "patient_input",</w:t>
+        <w:br/>
+        <w:t xml:space="preserve">        "height_cm": "patient_input"</w:t>
+        <w:br/>
+        <w:t xml:space="preserve">      }</w:t>
+        <w:br/>
+        <w:t xml:space="preserve">    },</w:t>
+        <w:br/>
+        <w:t xml:space="preserve">    "confirmed_by": "OPD Nurse (สมหญิง)",</w:t>
+        <w:br/>
+        <w:t xml:space="preserve">    "source_ref": {</w:t>
+        <w:br/>
+        <w:t xml:space="preserve">      "slip_code": "MCH-A1B2-C3D4",</w:t>
+        <w:br/>
+        <w:t xml:space="preserve">      "session_ref": "1f0b8c2e-4a77-4d1e-9d3a-2b6e5c7f81aa"</w:t>
+        <w:br/>
+        <w:t xml:space="preserve">    },</w:t>
+        <w:br/>
+        <w:t xml:space="preserve">    "rerouted": false</w:t>
+        <w:br/>
+        <w:t xml:space="preserve">  }</w:t>
+        <w:br/>
+        <w:t>}</w:t>
+      </w:r>
+    </w:p>
+    <w:p>
+      <w:pPr>
+        <w:spacing w:after="0"/>
+        <w:rPr>
+          <w:rFonts w:ascii="TH SarabunPSK" w:hAnsi="TH SarabunPSK" w:cs="TH SarabunPSK"/>
+          <w:sz w:val="32"/>
+          <w:szCs w:val="32"/>
+        </w:rPr>
+      </w:pPr>
+      <w:r>
+        <w:rPr>
+          <w:rFonts w:ascii="TH SarabunPSK" w:hAnsi="TH SarabunPSK" w:cs="TH SarabunPSK" w:hint="cs"/>
+          <w:sz w:val="32"/>
+          <w:szCs w:val="32"/>
+          <w:cs/>
+        </w:rPr>
+        <w:t>4.3. ตารางเทียบชื่อฟิลด์ (Prescreen ของโรงพยาบาล ↔ payload ของระบบเรา)</w:t>
+      </w:r>
+      <w:r>
+        <w:rPr>
+          <w:rFonts w:ascii="TH SarabunPSK" w:hAnsi="TH SarabunPSK" w:cs="TH SarabunPSK"/>
+          <w:sz w:val="32"/>
+          <w:szCs w:val="32"/>
+          <w:cs/>
+        </w:rPr>
+      </w:r>
+      <w:r>
+        <w:rPr>
+          <w:rFonts w:ascii="TH SarabunPSK" w:hAnsi="TH SarabunPSK" w:cs="TH SarabunPSK" w:hint="cs"/>
+          <w:sz w:val="32"/>
+          <w:szCs w:val="32"/>
+          <w:cs/>
+        </w:rPr>
+      </w:r>
+      <w:r>
+        <w:rPr>
+          <w:rFonts w:ascii="TH SarabunPSK" w:hAnsi="TH SarabunPSK" w:cs="TH SarabunPSK"/>
+          <w:sz w:val="32"/>
+          <w:szCs w:val="32"/>
+          <w:cs/>
+        </w:rPr>
+      </w:r>
+      <w:r>
+        <w:rPr>
+          <w:rFonts w:ascii="TH SarabunPSK" w:hAnsi="TH SarabunPSK" w:cs="TH SarabunPSK"/>
+          <w:sz w:val="32"/>
+          <w:szCs w:val="32"/>
+        </w:rPr>
+      </w:r>
+    </w:p>
+    <w:tbl>
+      <w:tblPr>
+        <w:tblStyle w:val="GridTable4-Accent1"/>
+        <w:tblW w:type="auto" w:w="0"/>
+        <w:tblLook w:firstColumn="1" w:firstRow="1" w:lastColumn="0" w:lastRow="0" w:noHBand="0" w:noVBand="1" w:val="04A0"/>
+      </w:tblPr>
+      <w:tblGrid>
+        <w:gridCol w:w="3120"/>
+        <w:gridCol w:w="3120"/>
+        <w:gridCol w:w="3120"/>
+      </w:tblGrid>
+      <w:tr>
+        <w:tc>
+          <w:tcPr>
+            <w:tcW w:type="dxa" w:w="3120"/>
+          </w:tcPr>
+          <w:p>
+            <w:r>
+              <w:t>คอลัมน์ในไฟล์ Prescreen</w:t>
+            </w:r>
+          </w:p>
+        </w:tc>
+        <w:tc>
+          <w:tcPr>
+            <w:tcW w:type="dxa" w:w="3120"/>
+          </w:tcPr>
+          <w:p>
+            <w:r>
+              <w:t>ฟิลด์ใน payload ของระบบเรา</w:t>
+            </w:r>
+          </w:p>
+        </w:tc>
+        <w:tc>
+          <w:tcPr>
+            <w:tcW w:type="dxa" w:w="3120"/>
+          </w:tcPr>
+          <w:p>
+            <w:r>
+              <w:t>ขั้นตอน</w:t>
+            </w:r>
+          </w:p>
+        </w:tc>
+      </w:tr>
+      <w:tr>
+        <w:tc>
+          <w:tcPr>
+            <w:tcW w:type="dxa" w:w="3120"/>
+          </w:tcPr>
+          <w:p>
+            <w:r>
+              <w:t>weight</w:t>
+            </w:r>
+          </w:p>
+        </w:tc>
+        <w:tc>
+          <w:tcPr>
+            <w:tcW w:type="dxa" w:w="3120"/>
+          </w:tcPr>
+          <w:p>
+            <w:r>
+              <w:t>vitals.weight_kg</w:t>
+            </w:r>
+          </w:p>
+        </w:tc>
+        <w:tc>
+          <w:tcPr>
+            <w:tcW w:type="dxa" w:w="3120"/>
+          </w:tcPr>
+          <w:p>
+            <w:r>
+              <w:t>ขั้นที่ 1</w:t>
+            </w:r>
+          </w:p>
+        </w:tc>
+      </w:tr>
+      <w:tr>
+        <w:tc>
+          <w:tcPr>
+            <w:tcW w:type="dxa" w:w="3120"/>
+          </w:tcPr>
+          <w:p>
+            <w:r>
+              <w:t>height</w:t>
+            </w:r>
+          </w:p>
+        </w:tc>
+        <w:tc>
+          <w:tcPr>
+            <w:tcW w:type="dxa" w:w="3120"/>
+          </w:tcPr>
+          <w:p>
+            <w:r>
+              <w:t>vitals.height_cm</w:t>
+            </w:r>
+          </w:p>
+        </w:tc>
+        <w:tc>
+          <w:tcPr>
+            <w:tcW w:type="dxa" w:w="3120"/>
+          </w:tcPr>
+          <w:p>
+            <w:r>
+              <w:t>ขั้นที่ 1</w:t>
+            </w:r>
+          </w:p>
+        </w:tc>
+      </w:tr>
+      <w:tr>
+        <w:tc>
+          <w:tcPr>
+            <w:tcW w:type="dxa" w:w="3120"/>
+          </w:tcPr>
+          <w:p>
+            <w:r>
+              <w:t>pressure</w:t>
+            </w:r>
+          </w:p>
+        </w:tc>
+        <w:tc>
+          <w:tcPr>
+            <w:tcW w:type="dxa" w:w="3120"/>
+          </w:tcPr>
+          <w:p>
+            <w:r>
+              <w:t>vitals.systolic + vitals.diastolic (แยกเป็น 2 ค่า)</w:t>
+            </w:r>
+          </w:p>
+        </w:tc>
+        <w:tc>
+          <w:tcPr>
+            <w:tcW w:type="dxa" w:w="3120"/>
+          </w:tcPr>
+          <w:p>
+            <w:r>
+              <w:t>ขั้นที่ 1</w:t>
+            </w:r>
+          </w:p>
+        </w:tc>
+      </w:tr>
+      <w:tr>
+        <w:tc>
+          <w:tcPr>
+            <w:tcW w:type="dxa" w:w="3120"/>
+          </w:tcPr>
+          <w:p>
+            <w:r>
+              <w:t>temperature</w:t>
+            </w:r>
+          </w:p>
+        </w:tc>
+        <w:tc>
+          <w:tcPr>
+            <w:tcW w:type="dxa" w:w="3120"/>
+          </w:tcPr>
+          <w:p>
+            <w:r>
+              <w:t>vitals.temperature_c</w:t>
+            </w:r>
+          </w:p>
+        </w:tc>
+        <w:tc>
+          <w:tcPr>
+            <w:tcW w:type="dxa" w:w="3120"/>
+          </w:tcPr>
+          <w:p>
+            <w:r>
+              <w:t>ขั้นที่ 1</w:t>
+            </w:r>
+          </w:p>
+        </w:tc>
+      </w:tr>
+      <w:tr>
+        <w:tc>
+          <w:tcPr>
+            <w:tcW w:type="dxa" w:w="3120"/>
+          </w:tcPr>
+          <w:p>
+            <w:r>
+              <w:t>pulse</w:t>
+            </w:r>
+          </w:p>
+        </w:tc>
+        <w:tc>
+          <w:tcPr>
+            <w:tcW w:type="dxa" w:w="3120"/>
+          </w:tcPr>
+          <w:p>
+            <w:r>
+              <w:t>vitals.pulse_bpm</w:t>
+            </w:r>
+          </w:p>
+        </w:tc>
+        <w:tc>
+          <w:tcPr>
+            <w:tcW w:type="dxa" w:w="3120"/>
+          </w:tcPr>
+          <w:p>
+            <w:r>
+              <w:t>ขั้นที่ 1</w:t>
+            </w:r>
+          </w:p>
+        </w:tc>
+      </w:tr>
+      <w:tr>
+        <w:tc>
+          <w:tcPr>
+            <w:tcW w:type="dxa" w:w="3120"/>
+          </w:tcPr>
+          <w:p>
+            <w:r>
+              <w:t>first_location_id / _name / _department</w:t>
+            </w:r>
+          </w:p>
+        </w:tc>
+        <w:tc>
+          <w:tcPr>
+            <w:tcW w:type="dxa" w:w="3120"/>
+          </w:tcPr>
+          <w:p>
+            <w:r>
+              <w:t>first_location.id / .name / .department</w:t>
+            </w:r>
+          </w:p>
+        </w:tc>
+        <w:tc>
+          <w:tcPr>
+            <w:tcW w:type="dxa" w:w="3120"/>
+          </w:tcPr>
+          <w:p>
+            <w:r>
+              <w:t>ขั้นที่ 1</w:t>
+            </w:r>
+          </w:p>
+        </w:tc>
+      </w:tr>
+      <w:tr>
+        <w:tc>
+          <w:tcPr>
+            <w:tcW w:type="dxa" w:w="3120"/>
+          </w:tcPr>
+          <w:p>
+            <w:r>
+              <w:t>nurse_chief_complaint</w:t>
+            </w:r>
+          </w:p>
+        </w:tc>
+        <w:tc>
+          <w:tcPr>
+            <w:tcW w:type="dxa" w:w="3120"/>
+          </w:tcPr>
+          <w:p>
+            <w:r>
+              <w:t>sbar.situation</w:t>
+            </w:r>
+          </w:p>
+        </w:tc>
+        <w:tc>
+          <w:tcPr>
+            <w:tcW w:type="dxa" w:w="3120"/>
+          </w:tcPr>
+          <w:p>
+            <w:r>
+              <w:t>ขั้นที่ 2</w:t>
+            </w:r>
+          </w:p>
+        </w:tc>
+      </w:tr>
+      <w:tr>
+        <w:tc>
+          <w:tcPr>
+            <w:tcW w:type="dxa" w:w="3120"/>
+          </w:tcPr>
+          <w:p>
+            <w:r>
+              <w:t>nurse_patient_illness</w:t>
+            </w:r>
+          </w:p>
+        </w:tc>
+        <w:tc>
+          <w:tcPr>
+            <w:tcW w:type="dxa" w:w="3120"/>
+          </w:tcPr>
+          <w:p>
+            <w:r>
+              <w:t>sbar.assessment_problem</w:t>
+            </w:r>
+          </w:p>
+        </w:tc>
+        <w:tc>
+          <w:tcPr>
+            <w:tcW w:type="dxa" w:w="3120"/>
+          </w:tcPr>
+          <w:p>
+            <w:r>
+              <w:t>ขั้นที่ 2</w:t>
+            </w:r>
+          </w:p>
+        </w:tc>
+      </w:tr>
+      <w:tr>
+        <w:tc>
+          <w:tcPr>
+            <w:tcW w:type="dxa" w:w="3120"/>
+          </w:tcPr>
+          <w:p>
+            <w:r>
+              <w:t>second_location_department</w:t>
+            </w:r>
+          </w:p>
+        </w:tc>
+        <w:tc>
+          <w:tcPr>
+            <w:tcW w:type="dxa" w:w="3120"/>
+          </w:tcPr>
+          <w:p>
+            <w:r>
+              <w:t>base_department_id</w:t>
+            </w:r>
+          </w:p>
+        </w:tc>
+        <w:tc>
+          <w:tcPr>
+            <w:tcW w:type="dxa" w:w="3120"/>
+          </w:tcPr>
+          <w:p>
+            <w:r>
+              <w:t>ขั้นที่ 2</w:t>
+            </w:r>
+          </w:p>
+        </w:tc>
+      </w:tr>
+      <w:tr>
+        <w:tc>
+          <w:tcPr>
+            <w:tcW w:type="dxa" w:w="3120"/>
+          </w:tcPr>
+          <w:p>
+            <w:r>
+              <w:t>(ยังไม่มีคอลัมน์รองรับ)</w:t>
+            </w:r>
+          </w:p>
+        </w:tc>
+        <w:tc>
+          <w:tcPr>
+            <w:tcW w:type="dxa" w:w="3120"/>
+          </w:tcPr>
+          <w:p>
+            <w:r>
+              <w:t>request_id, mfu_prescreen.* — คำขอเปลี่ยนแปลงข้อ 1, 2, 4</w:t>
+            </w:r>
+          </w:p>
+        </w:tc>
+        <w:tc>
+          <w:tcPr>
+            <w:tcW w:type="dxa" w:w="3120"/>
+          </w:tcPr>
+          <w:p>
+            <w:r>
+              <w:t>ขั้นที่ 2</w:t>
+            </w:r>
+          </w:p>
+        </w:tc>
+      </w:tr>
+    </w:tbl>
     <w:sectPr>
       <w:pgSz w:w="12240" w:h="15840"/>
       <w:pgMar w:top="1440" w:right="1440" w:bottom="1440" w:left="1440" w:header="708" w:footer="708" w:gutter="0"/>

</xml_diff>

<commit_message>
feat(sbar): stop restating the vitals in sbar.assessment
The vitals were going to the hospital twice at stage 2: as a Thai sentence
inside sbar.assessment and as numbers in mfu_prescreen.vitals. The same
reading in two shapes drifts the moment a nurse edits one of them, and a
sentence cannot carry provenance anyone can query.

Now they travel once, as numbers with a per-vital sources map. assessment
keeps only the triage level and pain score, which have no structured field
in the contract yet (CR 1). _vitals_line and its provenance-prose tests go
with it — sources is built in routers/vitals.py and rides the structured
payload, so nothing is lost but the rendering.

The hospital-facing collection and the data-requirements doc now show the
six vital fields we hold, once, and invite them to tell us if the shape
does not suit their system.

Co-Authored-By: Claude Opus 5 <noreply@anthropic.com>
Claude-Session: https://claude.ai/code/session_013jGr64EsyUjwXguxfZMkqs
</commit_message>
<xml_diff>
--- a/docs/data-requirements-hospital.docx
+++ b/docs/data-requirements-hospital.docx
@@ -8599,7 +8599,7 @@
         <w:br/>
         <w:t xml:space="preserve">    "background": "โรคประจำตัว: ความดันโลหิตสูง | แพ้ยา/แพ้สาร: ไม่มี",</w:t>
         <w:br/>
-        <w:t xml:space="preserve">    "assessment": "วัดที่บูธ: ความดัน 158/94 ชีพจร 96 อุณหภูมิ 36.8 น้ำหนัก 72.5 กก. ส่วนสูง 165 ซม. | ระดับคัดกรอง 3 (Urgent) | ระดับความเจ็บปวด 6/10",</w:t>
+        <w:t xml:space="preserve">    "assessment": "ระดับคัดกรอง 3 (Urgent) | ระดับความเจ็บปวด 6/10",</w:t>
         <w:br/>
         <w:t xml:space="preserve">    "assessment_problem": "เจ็บหน้าอกร่วมกับปัจจัยเสี่ยงโรคหัวใจ (คู่มือคัดกรอง MFU ข้อ 4.2)",</w:t>
         <w:br/>
@@ -9332,7 +9332,7 @@
           </w:tcPr>
           <w:p>
             <w:r>
-              <w:t>ค่าที่วัดได้ ระดับคัดกรอง และระดับความเจ็บปวด — อยู่ในรูปข้อความ ไม่ใช่ตัวเลขแยกฟิลด์ (ดูหมายเหตุใต้ตาราง)</w:t>
+              <w:t>ระดับคัดกรองและระดับความเจ็บปวด — ไม่ใส่ค่าสัญญาณชีพซ้ำในช่องนี้ ค่าสัญญาณชีพส่งเป็นตัวเลขแยกฟิลด์ที่เดียว (ดูหมายเหตุใต้ตาราง)</w:t>
             </w:r>
           </w:p>
         </w:tc>
@@ -9342,7 +9342,7 @@
           </w:tcPr>
           <w:p>
             <w:r>
-              <w:t>วัดที่บูธ: ความดัน 158/94 ชีพจร 96 | ระดับคัดกรอง 3 (Urgent)</w:t>
+              <w:t>ระดับคัดกรอง 3 (Urgent) | ระดับความเจ็บปวด 6/10</w:t>
             </w:r>
           </w:p>
         </w:tc>
@@ -9572,7 +9572,7 @@
           <w:b w:val="0"/>
           <w:i/>
         </w:rPr>
-        <w:t>หมายเหตุ: SBAR ไม่ใช่ข้อมูลสัญญาณชีพ แต่เป็นข้อความส่งต่อทางคลินิก 7 ช่อง ตาม API ของโรงพยาบาล ค่าสัญญาณชีพจึงปรากฏ 2 ที่ในขั้นที่ 2 โดยตั้งใจ คือ (1) ในรูปประโยคภายใน sbar.assessment สำหรับให้เจ้าหน้าที่อ่าน และ (2) เป็นตัวเลขแยกฟิลด์ใน mfu_prescreen.vitals สำหรับให้ระบบนำไปใช้ต่อ เพราะ API ปัจจุบันยังไม่มีช่องสำหรับค่าสัญญาณชีพแบบแยกฟิลด์ และไม่มีช่องสำหรับระดับคัดกรอง (คำขอเปลี่ยนแปลงข้อ 1 และ 2) หากเพิ่มช่องทั้งสองได้ ค่าซ้ำในข้อความจะถูกตัดออก</w:t>
+        <w:t>หมายเหตุ: SBAR ไม่ใช่ข้อมูลสัญญาณชีพ แต่เป็นข้อความส่งต่อทางคลินิก 7 ช่อง ตาม API ของโรงพยาบาล ค่าสัญญาณชีพที่ระบบเรามีมีเพียง 6 ค่า คือ systolic, diastolic, pulse_bpm, temperature_c, weight_kg, height_cm พร้อม measured_at และ sources (ที่มาของแต่ละค่า) ตามหัวข้อ 2.1 และ 2.4 — ส่งเป็นตัวเลขแยกฟิลด์ ครั้งเดียว ไม่เขียนซ้ำเป็นข้อความใน sbar.assessment เพราะค่าเดียวกันใน 2 รูปแบบ จะไม่ตรงกันทันทีที่มีการแก้ไขฝั่งใดฝั่งหนึ่ง และข้อความไม่สามารถเก็บที่มาของค่า ให้ค้นหาได้ หากรูปแบบนี้ไม่ตรงกับระบบของโรงพยาบาล แจ้งได้และเราจะปรับตาม</w:t>
       </w:r>
     </w:p>
     <w:sectPr>

</xml_diff>

<commit_message>
feat(his): send a derived bmi with the booth vitals
Their Prescreen export has a bmi column and they want it filled. We were
computing an implied BMI only as a unit-mix-up guard in check_vitals and
throwing it away, so the column was left to the HIS to derive.

with_bmi() derives it at send time from the weight and height in the same
payload rather than storing it — a stored BMI outlives a re-measure and
then contradicts the two numbers next to it. Applied in push_referral, so
every path that collects weight and height is covered by one change; the
sample bodies in the Postman collection run through the same function
instead of hardcoding the number.

The mock now prefers the bmi we send and only recomputes when it is absent.
Verified live: 72.5 kg / 165 cm lands as 26.63 in the export column.

Co-Authored-By: Claude Opus 5 <noreply@anthropic.com>
Claude-Session: https://claude.ai/code/session_013jGr64EsyUjwXguxfZMkqs
</commit_message>
<xml_diff>
--- a/docs/data-requirements-hospital.docx
+++ b/docs/data-requirements-hospital.docx
@@ -3740,7 +3740,7 @@
                 <w:szCs w:val="32"/>
                 <w:cs/>
               </w:rPr>
-              <w:t>ดัชนีมวลกาย (</w:t>
+              <w:t>ดัชนีมวลกาย (bmi) — ระบบเราคำนวณจาก weight และ height ตอนส่ง ไม่ได้เก็บไว้ ค่าที่ส่งจึงตรงกับน้ำหนักและส่วนสูงใน payload เดียวกันเสมอ</w:t>
             </w:r>
             <w:proofErr w:type="spellStart"/>
             <w:r>
@@ -3749,7 +3749,6 @@
                 <w:sz w:val="32"/>
                 <w:szCs w:val="32"/>
               </w:rPr>
-              <w:t>bmi</w:t>
             </w:r>
             <w:proofErr w:type="spellEnd"/>
             <w:r>
@@ -3759,7 +3758,6 @@
                 <w:szCs w:val="32"/>
                 <w:cs/>
               </w:rPr>
-              <w:t>)</w:t>
             </w:r>
           </w:p>
         </w:tc>
@@ -8512,7 +8510,9 @@
         <w:br/>
         <w:t xml:space="preserve">      "height_cm": "patient_input"</w:t>
         <w:br/>
-        <w:t xml:space="preserve">    }</w:t>
+        <w:t xml:space="preserve">    },</w:t>
+        <w:br/>
+        <w:t xml:space="preserve">    "bmi": 26.63</w:t>
         <w:br/>
         <w:t xml:space="preserve">  }</w:t>
         <w:br/>
@@ -8651,7 +8651,9 @@
         <w:br/>
         <w:t xml:space="preserve">        "height_cm": "patient_input"</w:t>
         <w:br/>
-        <w:t xml:space="preserve">      }</w:t>
+        <w:t xml:space="preserve">      },</w:t>
+        <w:br/>
+        <w:t xml:space="preserve">      "bmi": 26.63</w:t>
         <w:br/>
         <w:t xml:space="preserve">    },</w:t>
         <w:br/>
@@ -9572,7 +9574,7 @@
           <w:b w:val="0"/>
           <w:i/>
         </w:rPr>
-        <w:t>หมายเหตุ: SBAR ไม่ใช่ข้อมูลสัญญาณชีพ แต่เป็นข้อความส่งต่อทางคลินิก 7 ช่อง ตาม API ของโรงพยาบาล ค่าสัญญาณชีพที่ระบบเรามีมีเพียง 6 ค่า คือ systolic, diastolic, pulse_bpm, temperature_c, weight_kg, height_cm พร้อม measured_at และ sources (ที่มาของแต่ละค่า) ตามหัวข้อ 2.1 และ 2.4 — ส่งเป็นตัวเลขแยกฟิลด์ ครั้งเดียว ไม่เขียนซ้ำเป็นข้อความใน sbar.assessment เพราะค่าเดียวกันใน 2 รูปแบบ จะไม่ตรงกันทันทีที่มีการแก้ไขฝั่งใดฝั่งหนึ่ง และข้อความไม่สามารถเก็บที่มาของค่า ให้ค้นหาได้ ทั้งนี้ชุดค่าสัญญาณชีพของระบบเราไม่ตรงกับคอลัมน์ใน Prescreen แบบหนึ่งต่อหนึ่ง เช่น เราแยก pressure เป็น systolic/diastolic ไม่ได้คำนวณ bmi และมี sources ที่ยังไม่มีคอลัมน์รองรับ ซึ่งเป็นเรื่องปกติ โรงพยาบาลสามารถ map ค่าตามที่สะดวก (ดูตารางเทียบชื่อในข้อ 4.3)</w:t>
+        <w:t>หมายเหตุ: SBAR ไม่ใช่ข้อมูลสัญญาณชีพ แต่เป็นข้อความส่งต่อทางคลินิก 7 ช่อง ตาม API ของโรงพยาบาล ค่าสัญญาณชีพที่ระบบเรามีคือ systolic, diastolic, pulse_bpm, temperature_c, weight_kg, height_cm และ bmi พร้อม measured_at และ sources (ที่มาของแต่ละค่า) ตามหัวข้อ 2.1 และ 2.4 — ส่งเป็นตัวเลขแยกฟิลด์ ครั้งเดียว ไม่เขียนซ้ำเป็นข้อความใน sbar.assessment เพราะค่าเดียวกันใน 2 รูปแบบ จะไม่ตรงกันทันทีที่มีการแก้ไขฝั่งใดฝั่งหนึ่ง และข้อความไม่สามารถเก็บที่มาของค่า ให้ค้นหาได้ ทั้งนี้ชุดค่าสัญญาณชีพของระบบเราไม่ตรงกับคอลัมน์ใน Prescreen แบบหนึ่งต่อหนึ่ง เช่น เราแยก pressure เป็น systolic/diastolic ส่ง bmi ที่คำนวณตอนส่ง และมี sources ที่ยังไม่มีคอลัมน์รองรับ ซึ่งเป็นเรื่องปกติ โรงพยาบาลสามารถ map ค่าตามที่สะดวก (ดูตารางเทียบชื่อในข้อ 4.3)</w:t>
       </w:r>
     </w:p>
     <w:sectPr>

</xml_diff>

<commit_message>
docs: add the visit lookup and the history write-back examples
The doc listed what we read from the patient record but never showed the
call that gets us there. The booth only has the VN the patient types; until
that resolves we cannot confirm who is in front of us, and we never obtain
the visit_id that patient-assignments requires. It is the one endpoint that
blocks everything, so it is now 1.1 and the rest of section 1 shifts down.

1.3 also only showed the read half. A read without a write means every
visit is a first visit and the same patient answers the same five questions
forever, so the PUT example is now beside it — with the note that today we
still send smoking and alcohol combined and will split them once the shape
is agreed.

Visit fields and the sample come from the collection's own saved example,
not retyped.

Co-Authored-By: Claude Opus 5 <noreply@anthropic.com>
Claude-Session: https://claude.ai/code/session_013jGr64EsyUjwXguxfZMkqs
</commit_message>
<xml_diff>
--- a/docs/data-requirements-hospital.docx
+++ b/docs/data-requirements-hospital.docx
@@ -417,7 +417,7 @@
           <w:szCs w:val="32"/>
           <w:cs/>
         </w:rPr>
-        <w:t>1.1</w:t>
+        <w:t>1.1. ข้อมูลการเข้ารับบริการ (Visit Info) — ค้นหาด้วย VN ที่ผู้ป่วยกรอกที่บูธ</w:t>
       </w:r>
       <w:r>
         <w:rPr>
@@ -425,7 +425,6 @@
           <w:sz w:val="32"/>
           <w:szCs w:val="32"/>
         </w:rPr>
-        <w:t>.</w:t>
       </w:r>
       <w:r>
         <w:rPr>
@@ -434,7 +433,6 @@
           <w:szCs w:val="32"/>
           <w:cs/>
         </w:rPr>
-        <w:t xml:space="preserve"> ข้อมูลทั่วไปของผู้ป่วย (</w:t>
       </w:r>
       <w:r>
         <w:rPr>
@@ -442,7 +440,532 @@
           <w:sz w:val="32"/>
           <w:szCs w:val="32"/>
         </w:rPr>
-        <w:t>Patient Info)</w:t>
+      </w:r>
+    </w:p>
+    <w:tbl>
+      <w:tblPr>
+        <w:tblStyle w:val="GridTable4-Accent1"/>
+        <w:tblW w:type="auto" w:w="0"/>
+        <w:tblLook w:firstColumn="1" w:firstRow="1" w:lastColumn="0" w:lastRow="0" w:noHBand="0" w:noVBand="1" w:val="04A0"/>
+      </w:tblPr>
+      <w:tblGrid>
+        <w:gridCol w:w="1872"/>
+        <w:gridCol w:w="1872"/>
+        <w:gridCol w:w="1872"/>
+        <w:gridCol w:w="1872"/>
+        <w:gridCol w:w="1872"/>
+      </w:tblGrid>
+      <w:tr>
+        <w:tc>
+          <w:tcPr>
+            <w:tcW w:type="dxa" w:w="1872"/>
+          </w:tcPr>
+          <w:p>
+            <w:r>
+              <w:t>พารามิเตอร์ (Parameters)</w:t>
+            </w:r>
+          </w:p>
+        </w:tc>
+        <w:tc>
+          <w:tcPr>
+            <w:tcW w:type="dxa" w:w="1872"/>
+          </w:tcPr>
+          <w:p>
+            <w:r>
+              <w:t>ประเภทของข้อมูล (type)</w:t>
+            </w:r>
+          </w:p>
+        </w:tc>
+        <w:tc>
+          <w:tcPr>
+            <w:tcW w:type="dxa" w:w="1872"/>
+          </w:tcPr>
+          <w:p>
+            <w:r>
+              <w:t>คำอธิบาย (Description)</w:t>
+            </w:r>
+          </w:p>
+        </w:tc>
+        <w:tc>
+          <w:tcPr>
+            <w:tcW w:type="dxa" w:w="1872"/>
+          </w:tcPr>
+          <w:p>
+            <w:r>
+              <w:t>ตัวอย่างข้อมูล (Sample Data)</w:t>
+            </w:r>
+          </w:p>
+        </w:tc>
+        <w:tc>
+          <w:tcPr>
+            <w:tcW w:type="dxa" w:w="1872"/>
+          </w:tcPr>
+          <w:p>
+            <w:r>
+              <w:t>จำเป็น (Required)</w:t>
+            </w:r>
+          </w:p>
+        </w:tc>
+      </w:tr>
+      <w:tr>
+        <w:tc>
+          <w:tcPr>
+            <w:tcW w:type="dxa" w:w="1872"/>
+          </w:tcPr>
+          <w:p>
+            <w:r>
+              <w:t>visit_id</w:t>
+            </w:r>
+          </w:p>
+        </w:tc>
+        <w:tc>
+          <w:tcPr>
+            <w:tcW w:type="dxa" w:w="1872"/>
+          </w:tcPr>
+          <w:p>
+            <w:r>
+              <w:t>String</w:t>
+            </w:r>
+          </w:p>
+        </w:tc>
+        <w:tc>
+          <w:tcPr>
+            <w:tcW w:type="dxa" w:w="1872"/>
+          </w:tcPr>
+          <w:p>
+            <w:r>
+              <w:t>รหัสการเข้ารับบริการ (VN) — ระบบต้องส่งค่านี้กลับไปใน POST /patient-assignments ตอนพยาบาลยืนยัน จึงขาดไม่ได้</w:t>
+            </w:r>
+          </w:p>
+        </w:tc>
+        <w:tc>
+          <w:tcPr>
+            <w:tcW w:type="dxa" w:w="1872"/>
+          </w:tcPr>
+          <w:p>
+            <w:r>
+              <w:t>VISIT_ID_FROM_IMED</w:t>
+            </w:r>
+          </w:p>
+        </w:tc>
+        <w:tc>
+          <w:tcPr>
+            <w:tcW w:type="dxa" w:w="1872"/>
+          </w:tcPr>
+          <w:p>
+            <w:r>
+              <w:t>Y</w:t>
+            </w:r>
+          </w:p>
+        </w:tc>
+      </w:tr>
+      <w:tr>
+        <w:tc>
+          <w:tcPr>
+            <w:tcW w:type="dxa" w:w="1872"/>
+          </w:tcPr>
+          <w:p>
+            <w:r>
+              <w:t>hn</w:t>
+            </w:r>
+          </w:p>
+        </w:tc>
+        <w:tc>
+          <w:tcPr>
+            <w:tcW w:type="dxa" w:w="1872"/>
+          </w:tcPr>
+          <w:p>
+            <w:r>
+              <w:t>String</w:t>
+            </w:r>
+          </w:p>
+        </w:tc>
+        <w:tc>
+          <w:tcPr>
+            <w:tcW w:type="dxa" w:w="1872"/>
+          </w:tcPr>
+          <w:p>
+            <w:r>
+              <w:t>รหัสประจำตัวผู้ป่วย ใช้เชื่อมไปยังประวัติและสัญญาณชีพเดิมในหัวข้อ 1.2–1.4</w:t>
+            </w:r>
+          </w:p>
+        </w:tc>
+        <w:tc>
+          <w:tcPr>
+            <w:tcW w:type="dxa" w:w="1872"/>
+          </w:tcPr>
+          <w:p>
+            <w:r>
+              <w:t>09900001</w:t>
+            </w:r>
+          </w:p>
+        </w:tc>
+        <w:tc>
+          <w:tcPr>
+            <w:tcW w:type="dxa" w:w="1872"/>
+          </w:tcPr>
+          <w:p>
+            <w:r>
+              <w:t>Y</w:t>
+            </w:r>
+          </w:p>
+        </w:tc>
+      </w:tr>
+      <w:tr>
+        <w:tc>
+          <w:tcPr>
+            <w:tcW w:type="dxa" w:w="1872"/>
+          </w:tcPr>
+          <w:p>
+            <w:r>
+              <w:t>patient_name</w:t>
+            </w:r>
+          </w:p>
+        </w:tc>
+        <w:tc>
+          <w:tcPr>
+            <w:tcW w:type="dxa" w:w="1872"/>
+          </w:tcPr>
+          <w:p>
+            <w:r>
+              <w:t>String</w:t>
+            </w:r>
+          </w:p>
+        </w:tc>
+        <w:tc>
+          <w:tcPr>
+            <w:tcW w:type="dxa" w:w="1872"/>
+          </w:tcPr>
+          <w:p>
+            <w:r>
+              <w:t>ชื่อผู้ป่วย ใช้ยืนยันว่ากำลังคัดกรองถูกคน — หากข้อมูลนี้อยู่เฉพาะในระเบียนผู้ป่วย (HN) แจ้งได้ เราจะอ่านจากหัวข้อ 1.2 แทน</w:t>
+            </w:r>
+          </w:p>
+        </w:tc>
+        <w:tc>
+          <w:tcPr>
+            <w:tcW w:type="dxa" w:w="1872"/>
+          </w:tcPr>
+          <w:p>
+            <w:r>
+              <w:t>สมชาย ใจดี</w:t>
+            </w:r>
+          </w:p>
+        </w:tc>
+        <w:tc>
+          <w:tcPr>
+            <w:tcW w:type="dxa" w:w="1872"/>
+          </w:tcPr>
+          <w:p>
+            <w:r>
+              <w:t>Y</w:t>
+            </w:r>
+          </w:p>
+        </w:tc>
+      </w:tr>
+      <w:tr>
+        <w:tc>
+          <w:tcPr>
+            <w:tcW w:type="dxa" w:w="1872"/>
+          </w:tcPr>
+          <w:p>
+            <w:r>
+              <w:t>birthdate</w:t>
+            </w:r>
+          </w:p>
+        </w:tc>
+        <w:tc>
+          <w:tcPr>
+            <w:tcW w:type="dxa" w:w="1872"/>
+          </w:tcPr>
+          <w:p>
+            <w:r>
+              <w:t>Date</w:t>
+            </w:r>
+          </w:p>
+        </w:tc>
+        <w:tc>
+          <w:tcPr>
+            <w:tcW w:type="dxa" w:w="1872"/>
+          </w:tcPr>
+          <w:p>
+            <w:r>
+              <w:t>วัน/เดือน/ปีเกิด ใช้คำนวณอายุ ซึ่งมีผลต่อเกณฑ์คัดกรอง โดยเฉพาะผู้ป่วยเด็ก</w:t>
+            </w:r>
+          </w:p>
+        </w:tc>
+        <w:tc>
+          <w:tcPr>
+            <w:tcW w:type="dxa" w:w="1872"/>
+          </w:tcPr>
+          <w:p>
+            <w:r>
+              <w:t>1968-03-14</w:t>
+            </w:r>
+          </w:p>
+        </w:tc>
+        <w:tc>
+          <w:tcPr>
+            <w:tcW w:type="dxa" w:w="1872"/>
+          </w:tcPr>
+          <w:p>
+            <w:r>
+              <w:t>Y</w:t>
+            </w:r>
+          </w:p>
+        </w:tc>
+      </w:tr>
+      <w:tr>
+        <w:tc>
+          <w:tcPr>
+            <w:tcW w:type="dxa" w:w="1872"/>
+          </w:tcPr>
+          <w:p>
+            <w:r>
+              <w:t>active</w:t>
+            </w:r>
+          </w:p>
+        </w:tc>
+        <w:tc>
+          <w:tcPr>
+            <w:tcW w:type="dxa" w:w="1872"/>
+          </w:tcPr>
+          <w:p>
+            <w:r>
+              <w:t>Boolean</w:t>
+            </w:r>
+          </w:p>
+        </w:tc>
+        <w:tc>
+          <w:tcPr>
+            <w:tcW w:type="dxa" w:w="1872"/>
+          </w:tcPr>
+          <w:p>
+            <w:r>
+              <w:t>visit ยังเปิดอยู่หรือไม่ — ถ้าปิดหรือจำหน่ายแล้ว ระบบจะไม่เริ่มคัดกรอง</w:t>
+            </w:r>
+          </w:p>
+        </w:tc>
+        <w:tc>
+          <w:tcPr>
+            <w:tcW w:type="dxa" w:w="1872"/>
+          </w:tcPr>
+          <w:p>
+            <w:r>
+              <w:t>true</w:t>
+            </w:r>
+          </w:p>
+        </w:tc>
+        <w:tc>
+          <w:tcPr>
+            <w:tcW w:type="dxa" w:w="1872"/>
+          </w:tcPr>
+          <w:p>
+            <w:r>
+              <w:t>Y</w:t>
+            </w:r>
+          </w:p>
+        </w:tc>
+      </w:tr>
+      <w:tr>
+        <w:tc>
+          <w:tcPr>
+            <w:tcW w:type="dxa" w:w="1872"/>
+          </w:tcPr>
+          <w:p>
+            <w:r>
+              <w:t>appointment</w:t>
+            </w:r>
+          </w:p>
+        </w:tc>
+        <w:tc>
+          <w:tcPr>
+            <w:tcW w:type="dxa" w:w="1872"/>
+          </w:tcPr>
+          <w:p>
+            <w:r>
+              <w:t>Boolean</w:t>
+            </w:r>
+          </w:p>
+        </w:tc>
+        <w:tc>
+          <w:tcPr>
+            <w:tcW w:type="dxa" w:w="1872"/>
+          </w:tcPr>
+          <w:p>
+            <w:r>
+              <w:t>เป็นผู้ป่วยนัดหรือไม่ (ใช้ประกอบการแสดงผลเท่านั้น)</w:t>
+            </w:r>
+          </w:p>
+        </w:tc>
+        <w:tc>
+          <w:tcPr>
+            <w:tcW w:type="dxa" w:w="1872"/>
+          </w:tcPr>
+          <w:p>
+            <w:r>
+              <w:t>false</w:t>
+            </w:r>
+          </w:p>
+        </w:tc>
+        <w:tc>
+          <w:tcPr>
+            <w:tcW w:type="dxa" w:w="1872"/>
+          </w:tcPr>
+          <w:p>
+            <w:r>
+              <w:t>N</w:t>
+            </w:r>
+          </w:p>
+        </w:tc>
+      </w:tr>
+      <w:tr>
+        <w:tc>
+          <w:tcPr>
+            <w:tcW w:type="dxa" w:w="1872"/>
+          </w:tcPr>
+          <w:p>
+            <w:r>
+              <w:t>vitals</w:t>
+            </w:r>
+          </w:p>
+        </w:tc>
+        <w:tc>
+          <w:tcPr>
+            <w:tcW w:type="dxa" w:w="1872"/>
+          </w:tcPr>
+          <w:p>
+            <w:r>
+              <w:t>Object</w:t>
+            </w:r>
+          </w:p>
+        </w:tc>
+        <w:tc>
+          <w:tcPr>
+            <w:tcW w:type="dxa" w:w="1872"/>
+          </w:tcPr>
+          <w:p>
+            <w:r>
+              <w:t>ค่าสัญญาณชีพที่โรงพยาบาลวัดไว้แล้ว (ถ้ามี) เพื่อไม่ต้องวัดซ้ำที่บูธ</w:t>
+            </w:r>
+          </w:p>
+        </w:tc>
+        <w:tc>
+          <w:tcPr>
+            <w:tcW w:type="dxa" w:w="1872"/>
+          </w:tcPr>
+          <w:p>
+            <w:r>
+              <w:t>{ "systolic": null, "diastolic": null, "temperature": null }</w:t>
+            </w:r>
+          </w:p>
+        </w:tc>
+        <w:tc>
+          <w:tcPr>
+            <w:tcW w:type="dxa" w:w="1872"/>
+          </w:tcPr>
+          <w:p>
+            <w:r>
+              <w:t>N</w:t>
+            </w:r>
+          </w:p>
+        </w:tc>
+      </w:tr>
+    </w:tbl>
+    <w:p>
+      <w:r>
+        <w:rPr>
+          <w:b w:val="0"/>
+          <w:i/>
+        </w:rPr>
+        <w:t>หมายเหตุ: เป็นการค้นหาครั้งละ 1 รายการ ด้วย VN ที่ผู้ป่วยกรอกเองที่บูธเท่านั้น ไม่ใช่การค้นหาหรือไล่ดูรายชื่อผู้ป่วย — และเป็น endpoint ที่จำเป็นที่สุด หากไม่มี ระบบจะเริ่มคัดกรองไม่ได้เลย เพราะไม่สามารถระบุตัวผู้ป่วย และไม่ได้ค่า visit_id ที่ต้องส่งกลับตอนพยาบาลยืนยัน</w:t>
+      </w:r>
+    </w:p>
+    <w:p>
+      <w:r>
+        <w:rPr>
+          <w:b/>
+          <w:i/>
+        </w:rPr>
+        <w:t>ตัวอย่าง JSON — GET — ข้อมูลการเข้ารับบริการ</w:t>
+      </w:r>
+    </w:p>
+    <w:p>
+      <w:r>
+        <w:rPr>
+          <w:rFonts w:ascii="Consolas" w:hAnsi="Consolas"/>
+          <w:b w:val="0"/>
+          <w:i w:val="0"/>
+          <w:color w:val="1F3A5F"/>
+          <w:sz w:val="18"/>
+        </w:rPr>
+        <w:t>{</w:t>
+        <w:br/>
+        <w:t xml:space="preserve">  "visit_id": "VISIT_ID_FROM_IMED",</w:t>
+        <w:br/>
+        <w:t xml:space="preserve">  "hn": "09900001",</w:t>
+        <w:br/>
+        <w:t xml:space="preserve">  "patient_name": "สมชาย ใจดี",</w:t>
+        <w:br/>
+        <w:t xml:space="preserve">  "birthdate": "1968-03-14",</w:t>
+        <w:br/>
+        <w:t xml:space="preserve">  "active": true,</w:t>
+        <w:br/>
+        <w:t xml:space="preserve">  "appointment": false,</w:t>
+        <w:br/>
+        <w:t xml:space="preserve">  "vitals": {</w:t>
+        <w:br/>
+        <w:t xml:space="preserve">    "systolic": null,</w:t>
+        <w:br/>
+        <w:t xml:space="preserve">    "diastolic": null,</w:t>
+        <w:br/>
+        <w:t xml:space="preserve">    "temperature": null</w:t>
+        <w:br/>
+        <w:t xml:space="preserve">  }</w:t>
+        <w:br/>
+        <w:t>}</w:t>
+      </w:r>
+    </w:p>
+    <w:p>
+      <w:pPr>
+        <w:spacing w:after="0"/>
+        <w:ind w:firstLine="720"/>
+        <w:rPr>
+          <w:rFonts w:ascii="TH SarabunPSK" w:hAnsi="TH SarabunPSK" w:cs="TH SarabunPSK"/>
+          <w:sz w:val="32"/>
+          <w:szCs w:val="32"/>
+        </w:rPr>
+      </w:pPr>
+      <w:r>
+        <w:rPr>
+          <w:rFonts w:ascii="TH SarabunPSK" w:hAnsi="TH SarabunPSK" w:cs="TH SarabunPSK" w:hint="cs"/>
+          <w:sz w:val="32"/>
+          <w:szCs w:val="32"/>
+          <w:cs/>
+        </w:rPr>
+        <w:t>1.2. ข้อมูลทั่วไปของผู้ป่วย (Patient Info)</w:t>
+      </w:r>
+      <w:r>
+        <w:rPr>
+          <w:rFonts w:ascii="TH SarabunPSK" w:hAnsi="TH SarabunPSK" w:cs="TH SarabunPSK" w:hint="cs"/>
+          <w:sz w:val="32"/>
+          <w:szCs w:val="32"/>
+        </w:rPr>
+      </w:r>
+      <w:r>
+        <w:rPr>
+          <w:rFonts w:ascii="TH SarabunPSK" w:hAnsi="TH SarabunPSK" w:cs="TH SarabunPSK" w:hint="cs"/>
+          <w:sz w:val="32"/>
+          <w:szCs w:val="32"/>
+          <w:cs/>
+        </w:rPr>
+      </w:r>
+      <w:r>
+        <w:rPr>
+          <w:rFonts w:ascii="TH SarabunPSK" w:hAnsi="TH SarabunPSK" w:cs="TH SarabunPSK" w:hint="cs"/>
+          <w:sz w:val="32"/>
+          <w:szCs w:val="32"/>
+        </w:rPr>
       </w:r>
     </w:p>
     <w:tbl>
@@ -1221,7 +1744,7 @@
           <w:sz w:val="32"/>
           <w:szCs w:val="32"/>
         </w:rPr>
-        <w:t xml:space="preserve">1.2. </w:t>
+        <w:t>1.3. ประวัติการแพทย์ (Patient Medical History)</w:t>
       </w:r>
       <w:r>
         <w:rPr>
@@ -1230,7 +1753,6 @@
           <w:szCs w:val="32"/>
           <w:cs/>
         </w:rPr>
-        <w:t>ประวัติการแพทย์ (</w:t>
       </w:r>
       <w:r>
         <w:rPr>
@@ -1238,7 +1760,6 @@
           <w:sz w:val="32"/>
           <w:szCs w:val="32"/>
         </w:rPr>
-        <w:t>Patient Medical History)</w:t>
       </w:r>
     </w:p>
     <w:tbl>
@@ -2449,6 +2970,50 @@
       </w:r>
     </w:p>
     <w:p>
+      <w:r>
+        <w:rPr>
+          <w:b w:val="0"/>
+          <w:i/>
+        </w:rPr>
+        <w:t>หมายเหตุ: ประวัติชุดเดียวกันนี้ใช้ทั้งอ่านและเขียน — เมื่อผู้ป่วยยังไม่มีประวัติในระบบ (recorded_at ว่าง) ระบบจะถามระหว่างการคัดกรองด้วยเสียง แล้วเขียนกลับด้วย PUT /patients/{hn}/history โดยเขียนเฉพาะกรณีที่ยังว่างเท่านั้น ไม่ทับของเดิม หากโรงพยาบาลต้องการให้ลงบันทึกที่อื่นก่อนให้เจ้าหน้าที่ตรวจสอบ แจ้งได้ ทั้งนี้ระบบรุ่นปัจจุบันยังส่ง smoking และ alcohol รวมเป็นฟิลด์เดียว (smoking_alcohol) และจะแยกเป็น 2 ฟิลด์ตามตารางนี้เมื่อโรงพยาบาลยืนยันรูปแบบ</w:t>
+      </w:r>
+    </w:p>
+    <w:p>
+      <w:r>
+        <w:rPr>
+          <w:b/>
+          <w:i/>
+        </w:rPr>
+        <w:t>ตัวอย่าง JSON — PUT — เขียนประวัติกลับ (เฉพาะเมื่อยังไม่มีประวัติเดิม)</w:t>
+      </w:r>
+    </w:p>
+    <w:p>
+      <w:r>
+        <w:rPr>
+          <w:rFonts w:ascii="Consolas" w:hAnsi="Consolas"/>
+          <w:b w:val="0"/>
+          <w:i w:val="0"/>
+          <w:color w:val="1F3A5F"/>
+          <w:sz w:val="18"/>
+        </w:rPr>
+        <w:t>{</w:t>
+        <w:br/>
+        <w:t xml:space="preserve">  "smoking": "สูบบุหรี่วันละ 5 มวน",</w:t>
+        <w:br/>
+        <w:t xml:space="preserve">  "alcohol": "ไม่ดื่มสุรา",</w:t>
+        <w:br/>
+        <w:t xml:space="preserve">  "allergies": "แพ้ยาเพนนิซิลลิน",</w:t>
+        <w:br/>
+        <w:t xml:space="preserve">  "chronic_conditions": "ความดันโลหิตสูง",</w:t>
+        <w:br/>
+        <w:t xml:space="preserve">  "past_surgeries": null,</w:t>
+        <w:br/>
+        <w:t xml:space="preserve">  "family_history": "บิดาเป็นโรคหัวใจ"</w:t>
+        <w:br/>
+        <w:t>}</w:t>
+      </w:r>
+    </w:p>
+    <w:p>
       <w:pPr>
         <w:spacing w:after="0"/>
         <w:rPr>
@@ -2485,7 +3050,7 @@
           <w:szCs w:val="32"/>
           <w:cs/>
         </w:rPr>
-        <w:t>1.3. สัญญาณชีพล่าสุด (</w:t>
+        <w:t>1.4. สัญญาณชีพล่าสุด (Last_Vitals)</w:t>
       </w:r>
       <w:r>
         <w:rPr>
@@ -2493,7 +3058,6 @@
           <w:sz w:val="32"/>
           <w:szCs w:val="32"/>
         </w:rPr>
-        <w:t>Last_Vitals)</w:t>
       </w:r>
     </w:p>
     <w:tbl>

</xml_diff>

<commit_message>
docs: smoking and alcohol are two fields, and the appendix now shows the reads
Dropped the hedge about what our current build sends — the document states
the shape we are asking for, and the collection now matches it: two fields,
because they are separate risk factors and a combined string cannot be
queried. Deferred change A records the adapter work that follows.

The appendix showed only what we send. It now opens with the two reads the
session depends on — the visit lookup and the patient read — so the whole
exchange is visible in one place, in the order it happens. Existing entries
shift to 4.3-4.6; cross-references updated (the 'MFU manual clause 4.2'
citations are not appendix references and were left alone).

Co-Authored-By: Claude Opus 5 <noreply@anthropic.com>
Claude-Session: https://claude.ai/code/session_013jGr64EsyUjwXguxfZMkqs
</commit_message>
<xml_diff>
--- a/docs/data-requirements-hospital.docx
+++ b/docs/data-requirements-hospital.docx
@@ -2975,7 +2975,7 @@
           <w:b w:val="0"/>
           <w:i/>
         </w:rPr>
-        <w:t>หมายเหตุ: ประวัติชุดเดียวกันนี้ใช้ทั้งอ่านและเขียน — เมื่อผู้ป่วยยังไม่มีประวัติในระบบ (recorded_at ว่าง) ระบบจะถามระหว่างการคัดกรองด้วยเสียง แล้วเขียนกลับด้วย PUT /patients/{hn}/history โดยเขียนเฉพาะกรณีที่ยังว่างเท่านั้น ไม่ทับของเดิม หากโรงพยาบาลต้องการให้ลงบันทึกที่อื่นก่อนให้เจ้าหน้าที่ตรวจสอบ แจ้งได้ ทั้งนี้ระบบรุ่นปัจจุบันยังส่ง smoking และ alcohol รวมเป็นฟิลด์เดียว (smoking_alcohol) และจะแยกเป็น 2 ฟิลด์ตามตารางนี้เมื่อโรงพยาบาลยืนยันรูปแบบ</w:t>
+        <w:t>หมายเหตุ: ประวัติชุดเดียวกันนี้ใช้ทั้งอ่านและเขียน — เมื่อผู้ป่วยยังไม่มีประวัติในระบบ (recorded_at ว่าง) ระบบจะถามระหว่างการคัดกรองด้วยเสียง แล้วเขียนกลับด้วย PUT /patients/{hn}/history โดยเขียนเฉพาะกรณีที่ยังว่างเท่านั้น ไม่ทับของเดิม หากโรงพยาบาลต้องการให้ลงบันทึกที่อื่นก่อนให้เจ้าหน้าที่ตรวจสอบ แจ้งได้</w:t>
       </w:r>
     </w:p>
     <w:p>
@@ -4900,7 +4900,7 @@
                 <w:szCs w:val="32"/>
                 <w:cs/>
               </w:rPr>
-              <w:t>อาการหลักที่ทำให้มาโรงพยาบาล — ส่งในขั้นที่ 2 ภายใน sbar.situation (ดูภาคผนวก 4.2)</w:t>
+              <w:t>อาการหลักที่ทำให้มาโรงพยาบาล — ส่งในขั้นที่ 2 ภายใน sbar.situation (ดูภาคผนวก 4.4)</w:t>
             </w:r>
           </w:p>
         </w:tc>
@@ -5011,7 +5011,7 @@
                 <w:szCs w:val="32"/>
                 <w:cs/>
               </w:rPr>
-              <w:t>อาการป่วย — ส่งในขั้นที่ 2 ภายใน sbar.assessment_problem (ดูภาคผนวก 4.2)</w:t>
+              <w:t>อาการป่วย — ส่งในขั้นที่ 2 ภายใน sbar.assessment_problem (ดูภาคผนวก 4.4)</w:t>
             </w:r>
           </w:p>
         </w:tc>
@@ -5055,7 +5055,7 @@
           <w:b/>
           <w:i/>
         </w:rPr>
-        <w:t>ตัวอย่าง JSON — ค่าที่บันทึกในขั้นที่ 1 (คัดกรองเสร็จ รอพยาบาลยืนยัน) ยังไม่มีแผนกและยังไม่มีผลวินิจฉัย — แสดงตามชื่อคอลัมน์ Prescreen ส่วน payload จริงที่ระบบส่งอยู่ในภาคผนวก ข้อ 4.1</w:t>
+        <w:t>ตัวอย่าง JSON — ค่าที่บันทึกในขั้นที่ 1 (คัดกรองเสร็จ รอพยาบาลยืนยัน) ยังไม่มีแผนกและยังไม่มีผลวินิจฉัย — แสดงตามชื่อคอลัมน์ Prescreen ส่วน payload จริงที่ระบบส่งอยู่ในภาคผนวก ข้อ 4.3</w:t>
       </w:r>
     </w:p>
     <w:p>
@@ -8972,7 +8972,7 @@
           <w:szCs w:val="32"/>
           <w:cs/>
         </w:rPr>
-        <w:t>4.1. ขั้นที่ 1 — POST /patient-prescreens (หลังคัดกรองเสร็จ ก่อนพยาบาลยืนยัน)</w:t>
+        <w:t>4.1. ข้อมูลที่เราขอรับ — GET /visits/{visit_id} (ค้นหาด้วย VN ที่ผู้ป่วยกรอก)</w:t>
       </w:r>
       <w:r>
         <w:rPr>
@@ -9012,7 +9012,7 @@
           <w:b/>
           <w:i/>
         </w:rPr>
-        <w:t>ตัวอย่าง JSON — ข้อมูลที่วัดได้เท่านั้น ไม่มีแผนก ไม่มีระดับคัดกรอง ไม่มีผลวินิจฉัย</w:t>
+        <w:t>ตัวอย่าง JSON — รูปแบบที่ระบบเรานำไปใช้</w:t>
       </w:r>
     </w:p>
     <w:p>
@@ -9030,53 +9030,21 @@
         <w:br/>
         <w:t xml:space="preserve">  "hn": "09900001",</w:t>
         <w:br/>
-        <w:t xml:space="preserve">  "session_ref": "1f0b8c2e-4a77-4d1e-9d3a-2b6e5c7f81aa",</w:t>
-        <w:br/>
-        <w:t xml:space="preserve">  "slip_code": "MCH-A1B2-C3D4",</w:t>
-        <w:br/>
-        <w:t xml:space="preserve">  "first_location": {</w:t>
-        <w:br/>
-        <w:t xml:space="preserve">    "id": "AI-BOOTH-01",</w:t>
-        <w:br/>
-        <w:t xml:space="preserve">    "name": "AI Pre-Screening Booth",</w:t>
-        <w:br/>
-        <w:t xml:space="preserve">    "department": "แผนก ผู้ป่วยนอก(หน่วยคัดกรอง)"</w:t>
-        <w:br/>
-        <w:t xml:space="preserve">  },</w:t>
-        <w:br/>
-        <w:t xml:space="preserve">  "measured_at": "2026-08-07T09:12:00+07:00",</w:t>
+        <w:t xml:space="preserve">  "patient_name": "สมชาย ใจดี",</w:t>
+        <w:br/>
+        <w:t xml:space="preserve">  "birthdate": "1968-03-14",</w:t>
+        <w:br/>
+        <w:t xml:space="preserve">  "active": true,</w:t>
+        <w:br/>
+        <w:t xml:space="preserve">  "appointment": false,</w:t>
         <w:br/>
         <w:t xml:space="preserve">  "vitals": {</w:t>
         <w:br/>
-        <w:t xml:space="preserve">    "systolic": 158,</w:t>
-        <w:br/>
-        <w:t xml:space="preserve">    "diastolic": 94,</w:t>
-        <w:br/>
-        <w:t xml:space="preserve">    "pulse_bpm": 96,</w:t>
-        <w:br/>
-        <w:t xml:space="preserve">    "temperature_c": 36.8,</w:t>
-        <w:br/>
-        <w:t xml:space="preserve">    "weight_kg": 72.5,</w:t>
-        <w:br/>
-        <w:t xml:space="preserve">    "height_cm": 165,</w:t>
-        <w:br/>
-        <w:t xml:space="preserve">    "sources": {</w:t>
-        <w:br/>
-        <w:t xml:space="preserve">      "systolic": "device",</w:t>
-        <w:br/>
-        <w:t xml:space="preserve">      "diastolic": "device",</w:t>
-        <w:br/>
-        <w:t xml:space="preserve">      "pulse_bpm": "device",</w:t>
-        <w:br/>
-        <w:t xml:space="preserve">      "temperature_c": "patient_input",</w:t>
-        <w:br/>
-        <w:t xml:space="preserve">      "weight_kg": "patient_input",</w:t>
-        <w:br/>
-        <w:t xml:space="preserve">      "height_cm": "patient_input"</w:t>
-        <w:br/>
-        <w:t xml:space="preserve">    },</w:t>
-        <w:br/>
-        <w:t xml:space="preserve">    "bmi": 26.63</w:t>
+        <w:t xml:space="preserve">    "systolic": null,</w:t>
+        <w:br/>
+        <w:t xml:space="preserve">    "diastolic": null,</w:t>
+        <w:br/>
+        <w:t xml:space="preserve">    "temperature": null</w:t>
         <w:br/>
         <w:t xml:space="preserve">  }</w:t>
         <w:br/>
@@ -9099,7 +9067,7 @@
           <w:szCs w:val="32"/>
           <w:cs/>
         </w:rPr>
-        <w:t>4.2. ขั้นที่ 2 — POST /patient-assignments (หลังพยาบาลยืนยัน)</w:t>
+        <w:t>4.2. ข้อมูลที่เราขอรับ — GET /patients/{hn} (ประวัติและสัญญาณชีพล่าสุด)</w:t>
       </w:r>
       <w:r>
         <w:rPr>
@@ -9139,7 +9107,7 @@
           <w:b/>
           <w:i/>
         </w:rPr>
-        <w:t>ตัวอย่าง JSON — ตาม API contract ของโรงพยาบาล เพิ่ม base_department_id และ hn ส่วน mfu_prescreen คือข้อมูลที่ยังไม่มีช่องรองรับ (คำขอเปลี่ยนแปลงข้อ 1, 2 และ 4)</w:t>
+        <w:t>ตัวอย่าง JSON — รูปแบบที่ระบบเรานำไปใช้</w:t>
       </w:r>
     </w:p>
     <w:p>
@@ -9153,85 +9121,37 @@
         </w:rPr>
         <w:t>{</w:t>
         <w:br/>
-        <w:t xml:space="preserve">  "request_id": "MFU-20260807-A1B2C3",</w:t>
-        <w:br/>
-        <w:t xml:space="preserve">  "visit_id": "VISIT_ID_FROM_IMED",</w:t>
-        <w:br/>
-        <w:t xml:space="preserve">  "sbar": {</w:t>
-        <w:br/>
-        <w:t xml:space="preserve">    "situation": "แน่นหน้าอกมา 2 ชั่วโมง ร้าวไปแขนซ้าย (อายุ 58 ปี)",</w:t>
-        <w:br/>
-        <w:t xml:space="preserve">    "background": "โรคประจำตัว: ความดันโลหิตสูง | แพ้ยา/แพ้สาร: ไม่มี",</w:t>
-        <w:br/>
-        <w:t xml:space="preserve">    "assessment": "ระดับคัดกรอง 3 (Urgent) | ระดับความเจ็บปวด 6/10",</w:t>
-        <w:br/>
-        <w:t xml:space="preserve">    "assessment_problem": "เจ็บหน้าอกร่วมกับปัจจัยเสี่ยงโรคหัวใจ (คู่มือคัดกรอง MFU ข้อ 4.2)",</w:t>
-        <w:br/>
-        <w:t xml:space="preserve">    "recommend": "ส่งต่อ แผนก OPD MED (อายุรกรรม) | ควรได้รับการตรวจภายใน 30 นาที",</w:t>
-        <w:br/>
-        <w:t xml:space="preserve">    "documentation": "รหัสสลิป MCH-A1B2-C3D4"</w:t>
+        <w:t xml:space="preserve">  "hn": "09900001",</w:t>
+        <w:br/>
+        <w:t xml:space="preserve">  "patient_name": "สมชาย ใจดี",</w:t>
+        <w:br/>
+        <w:t xml:space="preserve">  "birthdate": "1968-03-14",</w:t>
+        <w:br/>
+        <w:t xml:space="preserve">  "history": {</w:t>
+        <w:br/>
+        <w:t xml:space="preserve">    "allergies": "ไม่มี",</w:t>
+        <w:br/>
+        <w:t xml:space="preserve">    "chronic_conditions": "ความดันโลหิตสูง",</w:t>
+        <w:br/>
+        <w:t xml:space="preserve">    "past_surgeries": null,</w:t>
+        <w:br/>
+        <w:t xml:space="preserve">    "family_history": null,</w:t>
+        <w:br/>
+        <w:t xml:space="preserve">    "smoking": null,</w:t>
+        <w:br/>
+        <w:t xml:space="preserve">    "alcohol": null,</w:t>
+        <w:br/>
+        <w:t xml:space="preserve">    "recorded_at": "2026-02-11T09:20:00+07:00"</w:t>
         <w:br/>
         <w:t xml:space="preserve">  },</w:t>
         <w:br/>
-        <w:t xml:space="preserve">  "base_department_id": "DEPT_MED",</w:t>
-        <w:br/>
-        <w:t xml:space="preserve">  "hn": "09900001",</w:t>
-        <w:br/>
-        <w:t xml:space="preserve">  "mfu_prescreen": {</w:t>
-        <w:br/>
-        <w:t xml:space="preserve">    "triage_level": 3,</w:t>
-        <w:br/>
-        <w:t xml:space="preserve">    "triage_scale": "MOPH-5",</w:t>
-        <w:br/>
-        <w:t xml:space="preserve">    "triage_label": "Urgent",</w:t>
-        <w:br/>
-        <w:t xml:space="preserve">    "vitals": {</w:t>
-        <w:br/>
-        <w:t xml:space="preserve">      "systolic": 158,</w:t>
-        <w:br/>
-        <w:t xml:space="preserve">      "diastolic": 94,</w:t>
-        <w:br/>
-        <w:t xml:space="preserve">      "pulse_bpm": 96,</w:t>
-        <w:br/>
-        <w:t xml:space="preserve">      "temperature_c": 36.8,</w:t>
-        <w:br/>
-        <w:t xml:space="preserve">      "weight_kg": 72.5,</w:t>
-        <w:br/>
-        <w:t xml:space="preserve">      "height_cm": 165,</w:t>
-        <w:br/>
-        <w:t xml:space="preserve">      "measured_at": "2026-08-07T09:12:00+07:00",</w:t>
-        <w:br/>
-        <w:t xml:space="preserve">      "sources": {</w:t>
-        <w:br/>
-        <w:t xml:space="preserve">        "systolic": "device",</w:t>
-        <w:br/>
-        <w:t xml:space="preserve">        "diastolic": "device",</w:t>
-        <w:br/>
-        <w:t xml:space="preserve">        "pulse_bpm": "device",</w:t>
-        <w:br/>
-        <w:t xml:space="preserve">        "temperature_c": "patient_input",</w:t>
-        <w:br/>
-        <w:t xml:space="preserve">        "weight_kg": "patient_input",</w:t>
-        <w:br/>
-        <w:t xml:space="preserve">        "height_cm": "patient_input"</w:t>
-        <w:br/>
-        <w:t xml:space="preserve">      },</w:t>
-        <w:br/>
-        <w:t xml:space="preserve">      "bmi": 26.63</w:t>
-        <w:br/>
-        <w:t xml:space="preserve">    },</w:t>
-        <w:br/>
-        <w:t xml:space="preserve">    "confirmed_by": "OPD Nurse (สมหญิง)",</w:t>
-        <w:br/>
-        <w:t xml:space="preserve">    "source_ref": {</w:t>
-        <w:br/>
-        <w:t xml:space="preserve">      "slip_code": "MCH-A1B2-C3D4",</w:t>
-        <w:br/>
-        <w:t xml:space="preserve">      "session_ref": "1f0b8c2e-4a77-4d1e-9d3a-2b6e5c7f81aa"</w:t>
-        <w:br/>
-        <w:t xml:space="preserve">    },</w:t>
-        <w:br/>
-        <w:t xml:space="preserve">    "rerouted": false</w:t>
+        <w:t xml:space="preserve">  "last_vitals": {</w:t>
+        <w:br/>
+        <w:t xml:space="preserve">    "weight": 72.5,</w:t>
+        <w:br/>
+        <w:t xml:space="preserve">    "height": 165,</w:t>
+        <w:br/>
+        <w:t xml:space="preserve">    "measured_at": "2026-02-11T09:20:00+07:00"</w:t>
         <w:br/>
         <w:t xml:space="preserve">  }</w:t>
         <w:br/>
@@ -9254,7 +9174,289 @@
           <w:szCs w:val="32"/>
           <w:cs/>
         </w:rPr>
-        <w:t>4.3. ตารางเทียบชื่อฟิลด์ (Prescreen ของโรงพยาบาล ↔ payload ของระบบเรา)</w:t>
+        <w:t>4.3. ขั้นที่ 1 — POST /patient-prescreens (หลังคัดกรองเสร็จ ก่อนพยาบาลยืนยัน)</w:t>
+      </w:r>
+      <w:r>
+        <w:rPr>
+          <w:rFonts w:ascii="TH SarabunPSK" w:hAnsi="TH SarabunPSK" w:cs="TH SarabunPSK"/>
+          <w:sz w:val="32"/>
+          <w:szCs w:val="32"/>
+          <w:cs/>
+        </w:rPr>
+      </w:r>
+      <w:r>
+        <w:rPr>
+          <w:rFonts w:ascii="TH SarabunPSK" w:hAnsi="TH SarabunPSK" w:cs="TH SarabunPSK" w:hint="cs"/>
+          <w:sz w:val="32"/>
+          <w:szCs w:val="32"/>
+          <w:cs/>
+        </w:rPr>
+      </w:r>
+      <w:r>
+        <w:rPr>
+          <w:rFonts w:ascii="TH SarabunPSK" w:hAnsi="TH SarabunPSK" w:cs="TH SarabunPSK"/>
+          <w:sz w:val="32"/>
+          <w:szCs w:val="32"/>
+          <w:cs/>
+        </w:rPr>
+      </w:r>
+      <w:r>
+        <w:rPr>
+          <w:rFonts w:ascii="TH SarabunPSK" w:hAnsi="TH SarabunPSK" w:cs="TH SarabunPSK"/>
+          <w:sz w:val="32"/>
+          <w:szCs w:val="32"/>
+        </w:rPr>
+      </w:r>
+    </w:p>
+    <w:p>
+      <w:r>
+        <w:rPr>
+          <w:b/>
+          <w:i/>
+        </w:rPr>
+        <w:t>ตัวอย่าง JSON — ข้อมูลที่วัดได้เท่านั้น ไม่มีแผนก ไม่มีระดับคัดกรอง ไม่มีผลวินิจฉัย</w:t>
+      </w:r>
+    </w:p>
+    <w:p>
+      <w:r>
+        <w:rPr>
+          <w:rFonts w:ascii="Consolas" w:hAnsi="Consolas"/>
+          <w:b w:val="0"/>
+          <w:i w:val="0"/>
+          <w:color w:val="1F3A5F"/>
+          <w:sz w:val="18"/>
+        </w:rPr>
+        <w:t>{</w:t>
+        <w:br/>
+        <w:t xml:space="preserve">  "visit_id": "VISIT_ID_FROM_IMED",</w:t>
+        <w:br/>
+        <w:t xml:space="preserve">  "hn": "09900001",</w:t>
+        <w:br/>
+        <w:t xml:space="preserve">  "session_ref": "1f0b8c2e-4a77-4d1e-9d3a-2b6e5c7f81aa",</w:t>
+        <w:br/>
+        <w:t xml:space="preserve">  "slip_code": "MCH-A1B2-C3D4",</w:t>
+        <w:br/>
+        <w:t xml:space="preserve">  "first_location": {</w:t>
+        <w:br/>
+        <w:t xml:space="preserve">    "id": "AI-BOOTH-01",</w:t>
+        <w:br/>
+        <w:t xml:space="preserve">    "name": "AI Pre-Screening Booth",</w:t>
+        <w:br/>
+        <w:t xml:space="preserve">    "department": "แผนก ผู้ป่วยนอก(หน่วยคัดกรอง)"</w:t>
+        <w:br/>
+        <w:t xml:space="preserve">  },</w:t>
+        <w:br/>
+        <w:t xml:space="preserve">  "measured_at": "2026-08-07T09:12:00+07:00",</w:t>
+        <w:br/>
+        <w:t xml:space="preserve">  "vitals": {</w:t>
+        <w:br/>
+        <w:t xml:space="preserve">    "systolic": 158,</w:t>
+        <w:br/>
+        <w:t xml:space="preserve">    "diastolic": 94,</w:t>
+        <w:br/>
+        <w:t xml:space="preserve">    "pulse_bpm": 96,</w:t>
+        <w:br/>
+        <w:t xml:space="preserve">    "temperature_c": 36.8,</w:t>
+        <w:br/>
+        <w:t xml:space="preserve">    "weight_kg": 72.5,</w:t>
+        <w:br/>
+        <w:t xml:space="preserve">    "height_cm": 165,</w:t>
+        <w:br/>
+        <w:t xml:space="preserve">    "sources": {</w:t>
+        <w:br/>
+        <w:t xml:space="preserve">      "systolic": "device",</w:t>
+        <w:br/>
+        <w:t xml:space="preserve">      "diastolic": "device",</w:t>
+        <w:br/>
+        <w:t xml:space="preserve">      "pulse_bpm": "device",</w:t>
+        <w:br/>
+        <w:t xml:space="preserve">      "temperature_c": "patient_input",</w:t>
+        <w:br/>
+        <w:t xml:space="preserve">      "weight_kg": "patient_input",</w:t>
+        <w:br/>
+        <w:t xml:space="preserve">      "height_cm": "patient_input"</w:t>
+        <w:br/>
+        <w:t xml:space="preserve">    },</w:t>
+        <w:br/>
+        <w:t xml:space="preserve">    "bmi": 26.63</w:t>
+        <w:br/>
+        <w:t xml:space="preserve">  }</w:t>
+        <w:br/>
+        <w:t>}</w:t>
+      </w:r>
+    </w:p>
+    <w:p>
+      <w:pPr>
+        <w:spacing w:after="0"/>
+        <w:rPr>
+          <w:rFonts w:ascii="TH SarabunPSK" w:hAnsi="TH SarabunPSK" w:cs="TH SarabunPSK"/>
+          <w:sz w:val="32"/>
+          <w:szCs w:val="32"/>
+        </w:rPr>
+      </w:pPr>
+      <w:r>
+        <w:rPr>
+          <w:rFonts w:ascii="TH SarabunPSK" w:hAnsi="TH SarabunPSK" w:cs="TH SarabunPSK" w:hint="cs"/>
+          <w:sz w:val="32"/>
+          <w:szCs w:val="32"/>
+          <w:cs/>
+        </w:rPr>
+        <w:t>4.4. ขั้นที่ 2 — POST /patient-assignments (หลังพยาบาลยืนยัน)</w:t>
+      </w:r>
+      <w:r>
+        <w:rPr>
+          <w:rFonts w:ascii="TH SarabunPSK" w:hAnsi="TH SarabunPSK" w:cs="TH SarabunPSK"/>
+          <w:sz w:val="32"/>
+          <w:szCs w:val="32"/>
+          <w:cs/>
+        </w:rPr>
+      </w:r>
+      <w:r>
+        <w:rPr>
+          <w:rFonts w:ascii="TH SarabunPSK" w:hAnsi="TH SarabunPSK" w:cs="TH SarabunPSK" w:hint="cs"/>
+          <w:sz w:val="32"/>
+          <w:szCs w:val="32"/>
+          <w:cs/>
+        </w:rPr>
+      </w:r>
+      <w:r>
+        <w:rPr>
+          <w:rFonts w:ascii="TH SarabunPSK" w:hAnsi="TH SarabunPSK" w:cs="TH SarabunPSK"/>
+          <w:sz w:val="32"/>
+          <w:szCs w:val="32"/>
+          <w:cs/>
+        </w:rPr>
+      </w:r>
+      <w:r>
+        <w:rPr>
+          <w:rFonts w:ascii="TH SarabunPSK" w:hAnsi="TH SarabunPSK" w:cs="TH SarabunPSK"/>
+          <w:sz w:val="32"/>
+          <w:szCs w:val="32"/>
+        </w:rPr>
+      </w:r>
+    </w:p>
+    <w:p>
+      <w:r>
+        <w:rPr>
+          <w:b/>
+          <w:i/>
+        </w:rPr>
+        <w:t>ตัวอย่าง JSON — ตาม API contract ของโรงพยาบาล เพิ่ม base_department_id และ hn ส่วน mfu_prescreen คือข้อมูลที่ยังไม่มีช่องรองรับ (คำขอเปลี่ยนแปลงข้อ 1, 2 และ 4)</w:t>
+      </w:r>
+    </w:p>
+    <w:p>
+      <w:r>
+        <w:rPr>
+          <w:rFonts w:ascii="Consolas" w:hAnsi="Consolas"/>
+          <w:b w:val="0"/>
+          <w:i w:val="0"/>
+          <w:color w:val="1F3A5F"/>
+          <w:sz w:val="18"/>
+        </w:rPr>
+        <w:t>{</w:t>
+        <w:br/>
+        <w:t xml:space="preserve">  "request_id": "MFU-20260807-A1B2C3",</w:t>
+        <w:br/>
+        <w:t xml:space="preserve">  "visit_id": "VISIT_ID_FROM_IMED",</w:t>
+        <w:br/>
+        <w:t xml:space="preserve">  "sbar": {</w:t>
+        <w:br/>
+        <w:t xml:space="preserve">    "situation": "แน่นหน้าอกมา 2 ชั่วโมง ร้าวไปแขนซ้าย (อายุ 58 ปี)",</w:t>
+        <w:br/>
+        <w:t xml:space="preserve">    "background": "โรคประจำตัว: ความดันโลหิตสูง | แพ้ยา/แพ้สาร: ไม่มี",</w:t>
+        <w:br/>
+        <w:t xml:space="preserve">    "assessment": "ระดับคัดกรอง 3 (Urgent) | ระดับความเจ็บปวด 6/10",</w:t>
+        <w:br/>
+        <w:t xml:space="preserve">    "assessment_problem": "เจ็บหน้าอกร่วมกับปัจจัยเสี่ยงโรคหัวใจ (คู่มือคัดกรอง MFU ข้อ 4.2)",</w:t>
+        <w:br/>
+        <w:t xml:space="preserve">    "recommend": "ส่งต่อ แผนก OPD MED (อายุรกรรม) | ควรได้รับการตรวจภายใน 30 นาที",</w:t>
+        <w:br/>
+        <w:t xml:space="preserve">    "documentation": "รหัสสลิป MCH-A1B2-C3D4"</w:t>
+        <w:br/>
+        <w:t xml:space="preserve">  },</w:t>
+        <w:br/>
+        <w:t xml:space="preserve">  "base_department_id": "DEPT_MED",</w:t>
+        <w:br/>
+        <w:t xml:space="preserve">  "hn": "09900001",</w:t>
+        <w:br/>
+        <w:t xml:space="preserve">  "mfu_prescreen": {</w:t>
+        <w:br/>
+        <w:t xml:space="preserve">    "triage_level": 3,</w:t>
+        <w:br/>
+        <w:t xml:space="preserve">    "triage_scale": "MOPH-5",</w:t>
+        <w:br/>
+        <w:t xml:space="preserve">    "triage_label": "Urgent",</w:t>
+        <w:br/>
+        <w:t xml:space="preserve">    "vitals": {</w:t>
+        <w:br/>
+        <w:t xml:space="preserve">      "systolic": 158,</w:t>
+        <w:br/>
+        <w:t xml:space="preserve">      "diastolic": 94,</w:t>
+        <w:br/>
+        <w:t xml:space="preserve">      "pulse_bpm": 96,</w:t>
+        <w:br/>
+        <w:t xml:space="preserve">      "temperature_c": 36.8,</w:t>
+        <w:br/>
+        <w:t xml:space="preserve">      "weight_kg": 72.5,</w:t>
+        <w:br/>
+        <w:t xml:space="preserve">      "height_cm": 165,</w:t>
+        <w:br/>
+        <w:t xml:space="preserve">      "measured_at": "2026-08-07T09:12:00+07:00",</w:t>
+        <w:br/>
+        <w:t xml:space="preserve">      "sources": {</w:t>
+        <w:br/>
+        <w:t xml:space="preserve">        "systolic": "device",</w:t>
+        <w:br/>
+        <w:t xml:space="preserve">        "diastolic": "device",</w:t>
+        <w:br/>
+        <w:t xml:space="preserve">        "pulse_bpm": "device",</w:t>
+        <w:br/>
+        <w:t xml:space="preserve">        "temperature_c": "patient_input",</w:t>
+        <w:br/>
+        <w:t xml:space="preserve">        "weight_kg": "patient_input",</w:t>
+        <w:br/>
+        <w:t xml:space="preserve">        "height_cm": "patient_input"</w:t>
+        <w:br/>
+        <w:t xml:space="preserve">      },</w:t>
+        <w:br/>
+        <w:t xml:space="preserve">      "bmi": 26.63</w:t>
+        <w:br/>
+        <w:t xml:space="preserve">    },</w:t>
+        <w:br/>
+        <w:t xml:space="preserve">    "confirmed_by": "OPD Nurse (สมหญิง)",</w:t>
+        <w:br/>
+        <w:t xml:space="preserve">    "source_ref": {</w:t>
+        <w:br/>
+        <w:t xml:space="preserve">      "slip_code": "MCH-A1B2-C3D4",</w:t>
+        <w:br/>
+        <w:t xml:space="preserve">      "session_ref": "1f0b8c2e-4a77-4d1e-9d3a-2b6e5c7f81aa"</w:t>
+        <w:br/>
+        <w:t xml:space="preserve">    },</w:t>
+        <w:br/>
+        <w:t xml:space="preserve">    "rerouted": false</w:t>
+        <w:br/>
+        <w:t xml:space="preserve">  }</w:t>
+        <w:br/>
+        <w:t>}</w:t>
+      </w:r>
+    </w:p>
+    <w:p>
+      <w:pPr>
+        <w:spacing w:after="0"/>
+        <w:rPr>
+          <w:rFonts w:ascii="TH SarabunPSK" w:hAnsi="TH SarabunPSK" w:cs="TH SarabunPSK"/>
+          <w:sz w:val="32"/>
+          <w:szCs w:val="32"/>
+        </w:rPr>
+      </w:pPr>
+      <w:r>
+        <w:rPr>
+          <w:rFonts w:ascii="TH SarabunPSK" w:hAnsi="TH SarabunPSK" w:cs="TH SarabunPSK" w:hint="cs"/>
+          <w:sz w:val="32"/>
+          <w:szCs w:val="32"/>
+          <w:cs/>
+        </w:rPr>
+        <w:t>4.5. ตารางเทียบชื่อฟิลด์ (Prescreen ของโรงพยาบาล ↔ payload ของระบบเรา)</w:t>
       </w:r>
       <w:r>
         <w:rPr>
@@ -9668,7 +9870,7 @@
           <w:szCs w:val="32"/>
           <w:cs/>
         </w:rPr>
-        <w:t>4.4. รายละเอียดช่อง SBAR (ส่งในขั้นที่ 2)</w:t>
+        <w:t>4.6. รายละเอียดช่อง SBAR (ส่งในขั้นที่ 2)</w:t>
       </w:r>
       <w:r>
         <w:rPr>
@@ -10138,7 +10340,7 @@
           <w:b w:val="0"/>
           <w:i/>
         </w:rPr>
-        <w:t>หมายเหตุ: SBAR ไม่ใช่ข้อมูลสัญญาณชีพ แต่เป็นข้อความส่งต่อทางคลินิก 7 ช่อง ตาม API ของโรงพยาบาล ค่าสัญญาณชีพที่ระบบเรามีคือ systolic, diastolic, pulse_bpm, temperature_c, weight_kg, height_cm และ bmi พร้อม measured_at และ sources (ที่มาของแต่ละค่า) ตามหัวข้อ 2.1 และ 2.4 — ส่งเป็นตัวเลขแยกฟิลด์ ครั้งเดียว ไม่เขียนซ้ำเป็นข้อความใน sbar.assessment เพราะค่าเดียวกันใน 2 รูปแบบ จะไม่ตรงกันทันทีที่มีการแก้ไขฝั่งใดฝั่งหนึ่ง และข้อความไม่สามารถเก็บที่มาของค่า ให้ค้นหาได้ ทั้งนี้ชุดค่าสัญญาณชีพของระบบเราไม่ตรงกับคอลัมน์ใน Prescreen แบบหนึ่งต่อหนึ่ง เช่น เราแยก pressure เป็น systolic/diastolic ส่ง bmi ที่คำนวณตอนส่ง และมี sources ที่ยังไม่มีคอลัมน์รองรับ ซึ่งเป็นเรื่องปกติ โรงพยาบาลสามารถ map ค่าตามที่สะดวก (ดูตารางเทียบชื่อในข้อ 4.3)</w:t>
+        <w:t>หมายเหตุ: SBAR ไม่ใช่ข้อมูลสัญญาณชีพ แต่เป็นข้อความส่งต่อทางคลินิก 7 ช่อง ตาม API ของโรงพยาบาล ค่าสัญญาณชีพที่ระบบเรามีคือ systolic, diastolic, pulse_bpm, temperature_c, weight_kg, height_cm และ bmi พร้อม measured_at และ sources (ที่มาของแต่ละค่า) ตามหัวข้อ 2.1 และ 2.4 — ส่งเป็นตัวเลขแยกฟิลด์ ครั้งเดียว ไม่เขียนซ้ำเป็นข้อความใน sbar.assessment เพราะค่าเดียวกันใน 2 รูปแบบ จะไม่ตรงกันทันทีที่มีการแก้ไขฝั่งใดฝั่งหนึ่ง และข้อความไม่สามารถเก็บที่มาของค่า ให้ค้นหาได้ ทั้งนี้ชุดค่าสัญญาณชีพของระบบเราไม่ตรงกับคอลัมน์ใน Prescreen แบบหนึ่งต่อหนึ่ง เช่น เราแยก pressure เป็น systolic/diastolic ส่ง bmi ที่คำนวณตอนส่ง และมี sources ที่ยังไม่มีคอลัมน์รองรับ ซึ่งเป็นเรื่องปกติ โรงพยาบาลสามารถ map ค่าตามที่สะดวก (ดูตารางเทียบชื่อในข้อ 4.5)</w:t>
       </w:r>
     </w:p>
     <w:sectPr>

</xml_diff>